<commit_message>
Added DSA implementation of two sum
</commit_message>
<xml_diff>
--- a/programming_mental_models/p4_problem_solving_and_dsa_mental_models.docx
+++ b/programming_mental_models/p4_problem_solving_and_dsa_mental_models.docx
@@ -22,12 +22,66 @@
     </w:p>
     <w:p>
       <w:pPr>
-        <w:jc w:val="both"/>
-        <w:rPr>
-          <w:sz w:val="32"/>
-          <w:szCs w:val="32"/>
-        </w:rPr>
-      </w:pPr>
+        <w:pStyle w:val="ListParagraph"/>
+        <w:numPr>
+          <w:ilvl w:val="0"/>
+          <w:numId w:val="33"/>
+        </w:numPr>
+        <w:jc w:val="both"/>
+        <w:rPr>
+          <w:sz w:val="32"/>
+          <w:szCs w:val="32"/>
+        </w:rPr>
+      </w:pPr>
+      <w:r>
+        <w:rPr>
+          <w:sz w:val="32"/>
+          <w:szCs w:val="32"/>
+        </w:rPr>
+        <w:t>DSA Real-Life Usage………………………………………………………1</w:t>
+      </w:r>
+    </w:p>
+    <w:p>
+      <w:pPr>
+        <w:pStyle w:val="ListParagraph"/>
+        <w:numPr>
+          <w:ilvl w:val="0"/>
+          <w:numId w:val="33"/>
+        </w:numPr>
+        <w:jc w:val="both"/>
+        <w:rPr>
+          <w:sz w:val="32"/>
+          <w:szCs w:val="32"/>
+        </w:rPr>
+      </w:pPr>
+      <w:r>
+        <w:rPr>
+          <w:sz w:val="32"/>
+          <w:szCs w:val="32"/>
+        </w:rPr>
+        <w:t>Phase-1, Problem Solving Foundations…………………………….</w:t>
+      </w:r>
+    </w:p>
+    <w:p>
+      <w:pPr>
+        <w:pStyle w:val="ListParagraph"/>
+        <w:numPr>
+          <w:ilvl w:val="0"/>
+          <w:numId w:val="33"/>
+        </w:numPr>
+        <w:jc w:val="both"/>
+        <w:rPr>
+          <w:sz w:val="32"/>
+          <w:szCs w:val="32"/>
+        </w:rPr>
+      </w:pPr>
+      <w:r>
+        <w:rPr>
+          <w:sz w:val="32"/>
+          <w:szCs w:val="32"/>
+        </w:rPr>
+        <w:t>Two Sum Problem Breakdown………………………………………..</w:t>
+      </w:r>
     </w:p>
     <w:p>
       <w:pPr>
@@ -140,34 +194,7 @@
           <w:sz w:val="32"/>
           <w:szCs w:val="32"/>
         </w:rPr>
-        <w:t xml:space="preserve">Phase </w:t>
-      </w:r>
-      <w:r>
-        <w:rPr>
-          <w:b/>
-          <w:bCs/>
-          <w:sz w:val="32"/>
-          <w:szCs w:val="32"/>
-        </w:rPr>
-        <w:t>-1,</w:t>
-      </w:r>
-      <w:r>
-        <w:rPr>
-          <w:b/>
-          <w:bCs/>
-          <w:sz w:val="32"/>
-          <w:szCs w:val="32"/>
-        </w:rPr>
-        <w:t xml:space="preserve"> Problem Solving Foundations</w:t>
-      </w:r>
-      <w:r>
-        <w:rPr>
-          <w:b/>
-          <w:bCs/>
-          <w:sz w:val="32"/>
-          <w:szCs w:val="32"/>
-        </w:rPr>
-        <w:t>:</w:t>
+        <w:t>Phase -1, Problem Solving Foundations:</w:t>
       </w:r>
     </w:p>
     <w:p>
@@ -567,6 +594,1347 @@
         </w:rPr>
         <w:t xml:space="preserve"> so OOP needed only good for reusability and software production.</w:t>
       </w:r>
+    </w:p>
+    <w:p>
+      <w:pPr>
+        <w:jc w:val="both"/>
+        <w:rPr>
+          <w:sz w:val="32"/>
+          <w:szCs w:val="32"/>
+        </w:rPr>
+      </w:pPr>
+    </w:p>
+    <w:p>
+      <w:pPr>
+        <w:jc w:val="center"/>
+        <w:rPr>
+          <w:sz w:val="32"/>
+          <w:szCs w:val="32"/>
+        </w:rPr>
+      </w:pPr>
+      <w:r>
+        <w:rPr>
+          <w:sz w:val="32"/>
+          <w:szCs w:val="32"/>
+        </w:rPr>
+        <w:t>Break</w:t>
+      </w:r>
+    </w:p>
+    <w:p>
+      <w:pPr>
+        <w:jc w:val="both"/>
+        <w:rPr>
+          <w:b/>
+          <w:bCs/>
+          <w:sz w:val="32"/>
+          <w:szCs w:val="32"/>
+        </w:rPr>
+      </w:pPr>
+      <w:r>
+        <w:rPr>
+          <w:b/>
+          <w:bCs/>
+          <w:sz w:val="32"/>
+          <w:szCs w:val="32"/>
+        </w:rPr>
+        <w:t>Two Sum Problem Breakdown:</w:t>
+      </w:r>
+    </w:p>
+    <w:p>
+      <w:pPr>
+        <w:jc w:val="both"/>
+        <w:rPr>
+          <w:sz w:val="32"/>
+          <w:szCs w:val="32"/>
+        </w:rPr>
+      </w:pPr>
+      <w:r>
+        <w:rPr>
+          <w:sz w:val="32"/>
+          <w:szCs w:val="32"/>
+        </w:rPr>
+        <w:t># Find two numbers in an array whose sum equals the target.</w:t>
+      </w:r>
+    </w:p>
+    <w:p>
+      <w:pPr>
+        <w:jc w:val="both"/>
+        <w:rPr>
+          <w:sz w:val="32"/>
+          <w:szCs w:val="32"/>
+        </w:rPr>
+      </w:pPr>
+      <w:r>
+        <w:rPr>
+          <w:sz w:val="32"/>
+          <w:szCs w:val="32"/>
+        </w:rPr>
+        <w:t xml:space="preserve"># For this we use a dictionary or </w:t>
+      </w:r>
+      <w:r>
+        <w:rPr>
+          <w:b/>
+          <w:bCs/>
+          <w:sz w:val="32"/>
+          <w:szCs w:val="32"/>
+        </w:rPr>
+        <w:t>Map</w:t>
+      </w:r>
+      <w:r>
+        <w:rPr>
+          <w:sz w:val="32"/>
+          <w:szCs w:val="32"/>
+        </w:rPr>
+        <w:t xml:space="preserve"> (like frequency dictionary) to keep track of seen numbers and their indexes (dynamic programming, memorization approach)</w:t>
+      </w:r>
+    </w:p>
+    <w:p>
+      <w:pPr>
+        <w:jc w:val="both"/>
+        <w:rPr>
+          <w:sz w:val="32"/>
+          <w:szCs w:val="32"/>
+        </w:rPr>
+      </w:pPr>
+      <w:r>
+        <w:rPr>
+          <w:sz w:val="32"/>
+          <w:szCs w:val="32"/>
+        </w:rPr>
+        <w:t># Workflow:</w:t>
+      </w:r>
+    </w:p>
+    <w:p>
+      <w:pPr>
+        <w:jc w:val="both"/>
+        <w:rPr>
+          <w:sz w:val="32"/>
+          <w:szCs w:val="32"/>
+        </w:rPr>
+      </w:pPr>
+    </w:p>
+    <w:p>
+      <w:pPr>
+        <w:pStyle w:val="ListParagraph"/>
+        <w:numPr>
+          <w:ilvl w:val="0"/>
+          <w:numId w:val="32"/>
+        </w:numPr>
+        <w:jc w:val="both"/>
+        <w:rPr>
+          <w:b/>
+          <w:bCs/>
+          <w:sz w:val="32"/>
+          <w:szCs w:val="32"/>
+        </w:rPr>
+      </w:pPr>
+      <w:r>
+        <w:rPr>
+          <w:b/>
+          <w:bCs/>
+          <w:sz w:val="32"/>
+          <w:szCs w:val="32"/>
+        </w:rPr>
+        <w:t>Initially:</w:t>
+      </w:r>
+    </w:p>
+    <w:p>
+      <w:pPr>
+        <w:jc w:val="both"/>
+        <w:rPr>
+          <w:sz w:val="32"/>
+          <w:szCs w:val="32"/>
+        </w:rPr>
+      </w:pPr>
+      <w:r>
+        <w:rPr>
+          <w:sz w:val="32"/>
+          <w:szCs w:val="32"/>
+        </w:rPr>
+        <w:t xml:space="preserve"># </w:t>
+      </w:r>
+      <w:r>
+        <w:rPr>
+          <w:b/>
+          <w:bCs/>
+          <w:sz w:val="32"/>
+          <w:szCs w:val="32"/>
+        </w:rPr>
+        <w:t>seen</w:t>
+      </w:r>
+      <w:r>
+        <w:rPr>
+          <w:sz w:val="32"/>
+          <w:szCs w:val="32"/>
+        </w:rPr>
+        <w:t xml:space="preserve"> hash map is empty.</w:t>
+      </w:r>
+    </w:p>
+    <w:p>
+      <w:pPr>
+        <w:jc w:val="both"/>
+        <w:rPr>
+          <w:b/>
+          <w:bCs/>
+          <w:color w:val="D86DCB" w:themeColor="accent5" w:themeTint="99"/>
+          <w:sz w:val="32"/>
+          <w:szCs w:val="32"/>
+        </w:rPr>
+      </w:pPr>
+      <w:r>
+        <w:rPr>
+          <w:b/>
+          <w:bCs/>
+          <w:color w:val="D86DCB" w:themeColor="accent5" w:themeTint="99"/>
+          <w:sz w:val="32"/>
+          <w:szCs w:val="32"/>
+        </w:rPr>
+        <w:t xml:space="preserve">seen = {} </w:t>
+      </w:r>
+    </w:p>
+    <w:p>
+      <w:pPr>
+        <w:jc w:val="both"/>
+        <w:rPr>
+          <w:sz w:val="32"/>
+          <w:szCs w:val="32"/>
+        </w:rPr>
+      </w:pPr>
+    </w:p>
+    <w:p>
+      <w:pPr>
+        <w:pStyle w:val="ListParagraph"/>
+        <w:numPr>
+          <w:ilvl w:val="0"/>
+          <w:numId w:val="32"/>
+        </w:numPr>
+        <w:jc w:val="both"/>
+        <w:rPr>
+          <w:b/>
+          <w:bCs/>
+          <w:sz w:val="32"/>
+          <w:szCs w:val="32"/>
+        </w:rPr>
+      </w:pPr>
+      <w:r>
+        <w:rPr>
+          <w:b/>
+          <w:bCs/>
+          <w:sz w:val="32"/>
+          <w:szCs w:val="32"/>
+        </w:rPr>
+        <w:t>Iteration-1:</w:t>
+      </w:r>
+    </w:p>
+    <w:p>
+      <w:pPr>
+        <w:jc w:val="both"/>
+        <w:rPr>
+          <w:b/>
+          <w:bCs/>
+          <w:color w:val="D86DCB" w:themeColor="accent5" w:themeTint="99"/>
+          <w:sz w:val="32"/>
+          <w:szCs w:val="32"/>
+        </w:rPr>
+      </w:pPr>
+      <w:r>
+        <w:rPr>
+          <w:b/>
+          <w:bCs/>
+          <w:color w:val="D86DCB" w:themeColor="accent5" w:themeTint="99"/>
+          <w:sz w:val="32"/>
+          <w:szCs w:val="32"/>
+        </w:rPr>
+        <w:t>i = 0</w:t>
+      </w:r>
+    </w:p>
+    <w:p>
+      <w:pPr>
+        <w:jc w:val="both"/>
+        <w:rPr>
+          <w:b/>
+          <w:bCs/>
+          <w:color w:val="D86DCB" w:themeColor="accent5" w:themeTint="99"/>
+          <w:sz w:val="32"/>
+          <w:szCs w:val="32"/>
+        </w:rPr>
+      </w:pPr>
+      <w:r>
+        <w:rPr>
+          <w:b/>
+          <w:bCs/>
+          <w:color w:val="D86DCB" w:themeColor="accent5" w:themeTint="99"/>
+          <w:sz w:val="32"/>
+          <w:szCs w:val="32"/>
+        </w:rPr>
+        <w:t>nums[i] = 2</w:t>
+      </w:r>
+    </w:p>
+    <w:p>
+      <w:pPr>
+        <w:jc w:val="both"/>
+        <w:rPr>
+          <w:b/>
+          <w:bCs/>
+          <w:color w:val="D86DCB" w:themeColor="accent5" w:themeTint="99"/>
+          <w:sz w:val="32"/>
+          <w:szCs w:val="32"/>
+        </w:rPr>
+      </w:pPr>
+      <w:r>
+        <w:rPr>
+          <w:b/>
+          <w:bCs/>
+          <w:color w:val="D86DCB" w:themeColor="accent5" w:themeTint="99"/>
+          <w:sz w:val="32"/>
+          <w:szCs w:val="32"/>
+        </w:rPr>
+        <w:t>needed = 7</w:t>
+      </w:r>
+    </w:p>
+    <w:p>
+      <w:pPr>
+        <w:jc w:val="both"/>
+        <w:rPr>
+          <w:sz w:val="32"/>
+          <w:szCs w:val="32"/>
+        </w:rPr>
+      </w:pPr>
+      <w:r>
+        <w:rPr>
+          <w:sz w:val="32"/>
+          <w:szCs w:val="32"/>
+        </w:rPr>
+        <w:t xml:space="preserve"># is 7 in seen? </w:t>
+      </w:r>
+      <w:r>
+        <w:rPr>
+          <w:sz w:val="32"/>
+          <w:szCs w:val="32"/>
+        </w:rPr>
+        <w:sym w:font="Wingdings" w:char="F0E0"/>
+      </w:r>
+      <w:r>
+        <w:rPr>
+          <w:sz w:val="32"/>
+          <w:szCs w:val="32"/>
+        </w:rPr>
+        <w:t xml:space="preserve"> No. Remember the current number. Store it in the </w:t>
+      </w:r>
+      <w:r>
+        <w:rPr>
+          <w:b/>
+          <w:bCs/>
+          <w:sz w:val="32"/>
+          <w:szCs w:val="32"/>
+        </w:rPr>
+        <w:t>seen</w:t>
+      </w:r>
+      <w:r>
+        <w:rPr>
+          <w:sz w:val="32"/>
+          <w:szCs w:val="32"/>
+        </w:rPr>
+        <w:t xml:space="preserve"> Map with the number as Key and index as Value</w:t>
+      </w:r>
+    </w:p>
+    <w:p>
+      <w:pPr>
+        <w:jc w:val="both"/>
+        <w:rPr>
+          <w:b/>
+          <w:bCs/>
+          <w:color w:val="D86DCB" w:themeColor="accent5" w:themeTint="99"/>
+          <w:sz w:val="32"/>
+          <w:szCs w:val="32"/>
+        </w:rPr>
+      </w:pPr>
+      <w:r>
+        <w:rPr>
+          <w:b/>
+          <w:bCs/>
+          <w:color w:val="D86DCB" w:themeColor="accent5" w:themeTint="99"/>
+          <w:sz w:val="32"/>
+          <w:szCs w:val="32"/>
+        </w:rPr>
+        <w:t>seen = {</w:t>
+      </w:r>
+    </w:p>
+    <w:p>
+      <w:pPr>
+        <w:jc w:val="both"/>
+        <w:rPr>
+          <w:b/>
+          <w:bCs/>
+          <w:color w:val="D86DCB" w:themeColor="accent5" w:themeTint="99"/>
+          <w:sz w:val="32"/>
+          <w:szCs w:val="32"/>
+        </w:rPr>
+      </w:pPr>
+      <w:r>
+        <w:rPr>
+          <w:b/>
+          <w:bCs/>
+          <w:color w:val="D86DCB" w:themeColor="accent5" w:themeTint="99"/>
+          <w:sz w:val="32"/>
+          <w:szCs w:val="32"/>
+        </w:rPr>
+        <w:t xml:space="preserve">    2: 0</w:t>
+      </w:r>
+    </w:p>
+    <w:p>
+      <w:pPr>
+        <w:jc w:val="both"/>
+        <w:rPr>
+          <w:b/>
+          <w:bCs/>
+          <w:color w:val="D86DCB" w:themeColor="accent5" w:themeTint="99"/>
+          <w:sz w:val="32"/>
+          <w:szCs w:val="32"/>
+        </w:rPr>
+      </w:pPr>
+      <w:r>
+        <w:rPr>
+          <w:b/>
+          <w:bCs/>
+          <w:color w:val="D86DCB" w:themeColor="accent5" w:themeTint="99"/>
+          <w:sz w:val="32"/>
+          <w:szCs w:val="32"/>
+        </w:rPr>
+        <w:t>}</w:t>
+      </w:r>
+    </w:p>
+    <w:p>
+      <w:pPr>
+        <w:jc w:val="both"/>
+        <w:rPr>
+          <w:sz w:val="32"/>
+          <w:szCs w:val="32"/>
+        </w:rPr>
+      </w:pPr>
+    </w:p>
+    <w:p>
+      <w:pPr>
+        <w:pStyle w:val="ListParagraph"/>
+        <w:numPr>
+          <w:ilvl w:val="0"/>
+          <w:numId w:val="32"/>
+        </w:numPr>
+        <w:jc w:val="both"/>
+        <w:rPr>
+          <w:b/>
+          <w:bCs/>
+          <w:sz w:val="32"/>
+          <w:szCs w:val="32"/>
+        </w:rPr>
+      </w:pPr>
+      <w:r>
+        <w:rPr>
+          <w:b/>
+          <w:bCs/>
+          <w:sz w:val="32"/>
+          <w:szCs w:val="32"/>
+        </w:rPr>
+        <w:lastRenderedPageBreak/>
+        <w:t>Iteration-2:</w:t>
+      </w:r>
+    </w:p>
+    <w:p>
+      <w:pPr>
+        <w:jc w:val="both"/>
+        <w:rPr>
+          <w:b/>
+          <w:bCs/>
+          <w:color w:val="D86DCB" w:themeColor="accent5" w:themeTint="99"/>
+          <w:sz w:val="32"/>
+          <w:szCs w:val="32"/>
+        </w:rPr>
+      </w:pPr>
+      <w:r>
+        <w:rPr>
+          <w:b/>
+          <w:bCs/>
+          <w:color w:val="D86DCB" w:themeColor="accent5" w:themeTint="99"/>
+          <w:sz w:val="32"/>
+          <w:szCs w:val="32"/>
+        </w:rPr>
+        <w:t>i = 1</w:t>
+      </w:r>
+    </w:p>
+    <w:p>
+      <w:pPr>
+        <w:jc w:val="both"/>
+        <w:rPr>
+          <w:b/>
+          <w:bCs/>
+          <w:color w:val="D86DCB" w:themeColor="accent5" w:themeTint="99"/>
+          <w:sz w:val="32"/>
+          <w:szCs w:val="32"/>
+        </w:rPr>
+      </w:pPr>
+      <w:r>
+        <w:rPr>
+          <w:b/>
+          <w:bCs/>
+          <w:color w:val="D86DCB" w:themeColor="accent5" w:themeTint="99"/>
+          <w:sz w:val="32"/>
+          <w:szCs w:val="32"/>
+        </w:rPr>
+        <w:t>nums[i] = 7</w:t>
+      </w:r>
+    </w:p>
+    <w:p>
+      <w:pPr>
+        <w:jc w:val="both"/>
+        <w:rPr>
+          <w:b/>
+          <w:bCs/>
+          <w:color w:val="D86DCB" w:themeColor="accent5" w:themeTint="99"/>
+          <w:sz w:val="32"/>
+          <w:szCs w:val="32"/>
+        </w:rPr>
+      </w:pPr>
+      <w:r>
+        <w:rPr>
+          <w:b/>
+          <w:bCs/>
+          <w:color w:val="D86DCB" w:themeColor="accent5" w:themeTint="99"/>
+          <w:sz w:val="32"/>
+          <w:szCs w:val="32"/>
+        </w:rPr>
+        <w:t>needed = 2</w:t>
+      </w:r>
+    </w:p>
+    <w:p>
+      <w:pPr>
+        <w:jc w:val="both"/>
+        <w:rPr>
+          <w:sz w:val="32"/>
+          <w:szCs w:val="32"/>
+        </w:rPr>
+      </w:pPr>
+      <w:r>
+        <w:rPr>
+          <w:sz w:val="32"/>
+          <w:szCs w:val="32"/>
+        </w:rPr>
+        <w:t xml:space="preserve"># Is 2 in seen? </w:t>
+      </w:r>
+      <w:r>
+        <w:rPr>
+          <w:sz w:val="32"/>
+          <w:szCs w:val="32"/>
+        </w:rPr>
+        <w:sym w:font="Wingdings" w:char="F0E0"/>
+      </w:r>
+      <w:r>
+        <w:rPr>
+          <w:sz w:val="32"/>
+          <w:szCs w:val="32"/>
+        </w:rPr>
+        <w:t xml:space="preserve"> Yes! We already know where 2 is:</w:t>
+      </w:r>
+    </w:p>
+    <w:p>
+      <w:pPr>
+        <w:jc w:val="both"/>
+        <w:rPr>
+          <w:b/>
+          <w:bCs/>
+          <w:color w:val="D86DCB" w:themeColor="accent5" w:themeTint="99"/>
+          <w:sz w:val="32"/>
+          <w:szCs w:val="32"/>
+        </w:rPr>
+      </w:pPr>
+      <w:r>
+        <w:rPr>
+          <w:b/>
+          <w:bCs/>
+          <w:color w:val="D86DCB" w:themeColor="accent5" w:themeTint="99"/>
+          <w:sz w:val="32"/>
+          <w:szCs w:val="32"/>
+        </w:rPr>
+        <w:t>seen[2] == 0</w:t>
+      </w:r>
+    </w:p>
+    <w:p>
+      <w:pPr>
+        <w:jc w:val="both"/>
+        <w:rPr>
+          <w:sz w:val="32"/>
+          <w:szCs w:val="32"/>
+        </w:rPr>
+      </w:pPr>
+      <w:r>
+        <w:rPr>
+          <w:sz w:val="32"/>
+          <w:szCs w:val="32"/>
+        </w:rPr>
+        <w:t># So, the answer is (DONE):</w:t>
+      </w:r>
+    </w:p>
+    <w:p>
+      <w:pPr>
+        <w:jc w:val="both"/>
+        <w:rPr>
+          <w:b/>
+          <w:bCs/>
+          <w:sz w:val="28"/>
+          <w:szCs w:val="28"/>
+        </w:rPr>
+      </w:pPr>
+      <w:r>
+        <w:rPr>
+          <w:b/>
+          <w:bCs/>
+          <w:sz w:val="28"/>
+          <w:szCs w:val="28"/>
+        </w:rPr>
+        <w:t>[0, 1]</w:t>
+      </w:r>
+    </w:p>
+    <w:p>
+      <w:pPr>
+        <w:jc w:val="both"/>
+        <w:rPr>
+          <w:sz w:val="32"/>
+          <w:szCs w:val="32"/>
+        </w:rPr>
+      </w:pPr>
+    </w:p>
+    <w:p>
+      <w:pPr>
+        <w:jc w:val="both"/>
+        <w:rPr>
+          <w:sz w:val="32"/>
+          <w:szCs w:val="32"/>
+        </w:rPr>
+      </w:pPr>
+      <w:r>
+        <w:rPr>
+          <w:sz w:val="32"/>
+          <w:szCs w:val="32"/>
+        </w:rPr>
+        <w:t>The Pattern We Just Learned:</w:t>
+      </w:r>
+    </w:p>
+    <w:p>
+      <w:pPr>
+        <w:jc w:val="both"/>
+        <w:rPr>
+          <w:sz w:val="32"/>
+          <w:szCs w:val="32"/>
+        </w:rPr>
+      </w:pPr>
+      <w:r>
+        <w:rPr>
+          <w:sz w:val="32"/>
+          <w:szCs w:val="32"/>
+        </w:rPr>
+        <w:t xml:space="preserve"># This </w:t>
+      </w:r>
+      <w:r>
+        <w:rPr>
+          <w:sz w:val="32"/>
+          <w:szCs w:val="32"/>
+        </w:rPr>
+        <w:t>is one of the most important DSA patterns:</w:t>
+      </w:r>
+    </w:p>
+    <w:p>
+      <w:pPr>
+        <w:jc w:val="both"/>
+        <w:rPr>
+          <w:b/>
+          <w:bCs/>
+          <w:sz w:val="28"/>
+          <w:szCs w:val="28"/>
+        </w:rPr>
+      </w:pPr>
+      <w:r>
+        <w:rPr>
+          <w:b/>
+          <w:bCs/>
+          <w:sz w:val="28"/>
+          <w:szCs w:val="28"/>
+        </w:rPr>
+        <w:t>For each element:</w:t>
+      </w:r>
+    </w:p>
+    <w:p>
+      <w:pPr>
+        <w:jc w:val="both"/>
+        <w:rPr>
+          <w:b/>
+          <w:bCs/>
+          <w:sz w:val="28"/>
+          <w:szCs w:val="28"/>
+        </w:rPr>
+      </w:pPr>
+      <w:r>
+        <w:rPr>
+          <w:b/>
+          <w:bCs/>
+          <w:sz w:val="28"/>
+          <w:szCs w:val="28"/>
+        </w:rPr>
+        <w:t xml:space="preserve">    What do I need?</w:t>
+      </w:r>
+    </w:p>
+    <w:p>
+      <w:pPr>
+        <w:jc w:val="both"/>
+        <w:rPr>
+          <w:b/>
+          <w:bCs/>
+          <w:sz w:val="28"/>
+          <w:szCs w:val="28"/>
+        </w:rPr>
+      </w:pPr>
+      <w:r>
+        <w:rPr>
+          <w:b/>
+          <w:bCs/>
+          <w:sz w:val="28"/>
+          <w:szCs w:val="28"/>
+        </w:rPr>
+        <w:t xml:space="preserve">    Have I already seen it?</w:t>
+      </w:r>
+    </w:p>
+    <w:p>
+      <w:pPr>
+        <w:jc w:val="both"/>
+        <w:rPr>
+          <w:b/>
+          <w:bCs/>
+          <w:sz w:val="28"/>
+          <w:szCs w:val="28"/>
+        </w:rPr>
+      </w:pPr>
+      <w:r>
+        <w:rPr>
+          <w:b/>
+          <w:bCs/>
+          <w:sz w:val="28"/>
+          <w:szCs w:val="28"/>
+        </w:rPr>
+        <w:t xml:space="preserve">    If yes:</w:t>
+      </w:r>
+    </w:p>
+    <w:p>
+      <w:pPr>
+        <w:jc w:val="both"/>
+        <w:rPr>
+          <w:b/>
+          <w:bCs/>
+          <w:sz w:val="28"/>
+          <w:szCs w:val="28"/>
+        </w:rPr>
+      </w:pPr>
+      <w:r>
+        <w:rPr>
+          <w:b/>
+          <w:bCs/>
+          <w:sz w:val="28"/>
+          <w:szCs w:val="28"/>
+        </w:rPr>
+        <w:t xml:space="preserve">        Answer found!</w:t>
+      </w:r>
+    </w:p>
+    <w:p>
+      <w:pPr>
+        <w:jc w:val="both"/>
+        <w:rPr>
+          <w:b/>
+          <w:bCs/>
+          <w:sz w:val="28"/>
+          <w:szCs w:val="28"/>
+        </w:rPr>
+      </w:pPr>
+      <w:r>
+        <w:rPr>
+          <w:b/>
+          <w:bCs/>
+          <w:sz w:val="28"/>
+          <w:szCs w:val="28"/>
+        </w:rPr>
+        <w:t xml:space="preserve">        </w:t>
+      </w:r>
+      <w:r>
+        <w:rPr>
+          <w:b/>
+          <w:bCs/>
+          <w:sz w:val="28"/>
+          <w:szCs w:val="28"/>
+        </w:rPr>
+        <w:t>break out</w:t>
+      </w:r>
+    </w:p>
+    <w:p>
+      <w:pPr>
+        <w:jc w:val="both"/>
+        <w:rPr>
+          <w:b/>
+          <w:bCs/>
+          <w:sz w:val="28"/>
+          <w:szCs w:val="28"/>
+        </w:rPr>
+      </w:pPr>
+      <w:r>
+        <w:rPr>
+          <w:b/>
+          <w:bCs/>
+          <w:sz w:val="28"/>
+          <w:szCs w:val="28"/>
+        </w:rPr>
+        <w:t xml:space="preserve">    Otherwise</w:t>
+      </w:r>
+      <w:r>
+        <w:rPr>
+          <w:b/>
+          <w:bCs/>
+          <w:sz w:val="28"/>
+          <w:szCs w:val="28"/>
+        </w:rPr>
+        <w:t xml:space="preserve"> (else)</w:t>
+      </w:r>
+      <w:r>
+        <w:rPr>
+          <w:b/>
+          <w:bCs/>
+          <w:sz w:val="28"/>
+          <w:szCs w:val="28"/>
+        </w:rPr>
+        <w:t>:</w:t>
+      </w:r>
+    </w:p>
+    <w:p>
+      <w:pPr>
+        <w:jc w:val="both"/>
+        <w:rPr>
+          <w:b/>
+          <w:bCs/>
+          <w:sz w:val="28"/>
+          <w:szCs w:val="28"/>
+        </w:rPr>
+      </w:pPr>
+      <w:r>
+        <w:rPr>
+          <w:b/>
+          <w:bCs/>
+          <w:sz w:val="28"/>
+          <w:szCs w:val="28"/>
+        </w:rPr>
+        <w:t xml:space="preserve">        Remember the current element.</w:t>
+      </w:r>
+    </w:p>
+    <w:p>
+      <w:pPr>
+        <w:jc w:val="both"/>
+        <w:rPr>
+          <w:sz w:val="32"/>
+          <w:szCs w:val="32"/>
+        </w:rPr>
+      </w:pPr>
+      <w:r>
+        <w:rPr>
+          <w:sz w:val="32"/>
+          <w:szCs w:val="32"/>
+        </w:rPr>
+        <w:t xml:space="preserve"># </w:t>
+      </w:r>
+      <w:r>
+        <w:rPr>
+          <w:sz w:val="32"/>
+          <w:szCs w:val="32"/>
+        </w:rPr>
+        <w:t>This appears in dozens of interview questions.</w:t>
+      </w:r>
+      <w:r>
+        <w:rPr>
+          <w:sz w:val="32"/>
+          <w:szCs w:val="32"/>
+        </w:rPr>
+        <w:t xml:space="preserve"> Like a frequency </w:t>
+      </w:r>
+      <w:r>
+        <w:rPr>
+          <w:b/>
+          <w:bCs/>
+          <w:sz w:val="32"/>
+          <w:szCs w:val="32"/>
+        </w:rPr>
+        <w:t>Map</w:t>
+      </w:r>
+      <w:r>
+        <w:rPr>
+          <w:sz w:val="32"/>
+          <w:szCs w:val="32"/>
+        </w:rPr>
+        <w:t xml:space="preserve"> to remember or store values, a loop and </w:t>
+      </w:r>
+      <w:r>
+        <w:rPr>
+          <w:b/>
+          <w:bCs/>
+          <w:sz w:val="32"/>
+          <w:szCs w:val="32"/>
+        </w:rPr>
+        <w:t>if-else</w:t>
+      </w:r>
+      <w:r>
+        <w:rPr>
+          <w:sz w:val="32"/>
+          <w:szCs w:val="32"/>
+        </w:rPr>
+        <w:t xml:space="preserve"> block.</w:t>
+      </w:r>
+    </w:p>
+    <w:p>
+      <w:pPr>
+        <w:jc w:val="both"/>
+        <w:rPr>
+          <w:sz w:val="32"/>
+          <w:szCs w:val="32"/>
+        </w:rPr>
+      </w:pPr>
+    </w:p>
+    <w:p>
+      <w:pPr>
+        <w:jc w:val="both"/>
+        <w:rPr>
+          <w:sz w:val="32"/>
+          <w:szCs w:val="32"/>
+        </w:rPr>
+      </w:pPr>
+      <w:r>
+        <w:rPr>
+          <w:sz w:val="32"/>
+          <w:szCs w:val="32"/>
+        </w:rPr>
+        <w:t>Complexity Analysis:</w:t>
+      </w:r>
+    </w:p>
+    <w:p>
+      <w:pPr>
+        <w:jc w:val="both"/>
+        <w:rPr>
+          <w:sz w:val="32"/>
+          <w:szCs w:val="32"/>
+        </w:rPr>
+      </w:pPr>
+      <w:r>
+        <w:rPr>
+          <w:sz w:val="32"/>
+          <w:szCs w:val="32"/>
+        </w:rPr>
+        <w:t xml:space="preserve"># </w:t>
+      </w:r>
+      <w:r>
+        <w:rPr>
+          <w:sz w:val="32"/>
+          <w:szCs w:val="32"/>
+        </w:rPr>
+        <w:t>Time</w:t>
+      </w:r>
+      <w:r>
+        <w:rPr>
+          <w:sz w:val="32"/>
+          <w:szCs w:val="32"/>
+        </w:rPr>
+        <w:t xml:space="preserve"> Complexity </w:t>
+      </w:r>
+      <w:r>
+        <w:rPr>
+          <w:sz w:val="32"/>
+          <w:szCs w:val="32"/>
+        </w:rPr>
+        <w:sym w:font="Wingdings" w:char="F0E0"/>
+      </w:r>
+      <w:r>
+        <w:rPr>
+          <w:sz w:val="32"/>
+          <w:szCs w:val="32"/>
+        </w:rPr>
+        <w:t xml:space="preserve"> </w:t>
+      </w:r>
+      <w:r>
+        <w:rPr>
+          <w:sz w:val="32"/>
+          <w:szCs w:val="32"/>
+        </w:rPr>
+        <w:t>One pass through the array</w:t>
+      </w:r>
+      <w:r>
+        <w:rPr>
+          <w:sz w:val="32"/>
+          <w:szCs w:val="32"/>
+        </w:rPr>
+        <w:t>:</w:t>
+      </w:r>
+    </w:p>
+    <w:p>
+      <w:pPr>
+        <w:jc w:val="both"/>
+        <w:rPr>
+          <w:b/>
+          <w:bCs/>
+          <w:sz w:val="32"/>
+          <w:szCs w:val="32"/>
+        </w:rPr>
+      </w:pPr>
+      <w:r>
+        <w:rPr>
+          <w:b/>
+          <w:bCs/>
+          <w:sz w:val="32"/>
+          <w:szCs w:val="32"/>
+        </w:rPr>
+        <w:lastRenderedPageBreak/>
+        <w:t>O(n)</w:t>
+      </w:r>
+    </w:p>
+    <w:p>
+      <w:pPr>
+        <w:jc w:val="both"/>
+        <w:rPr>
+          <w:sz w:val="32"/>
+          <w:szCs w:val="32"/>
+        </w:rPr>
+      </w:pPr>
+      <w:r>
+        <w:rPr>
+          <w:sz w:val="32"/>
+          <w:szCs w:val="32"/>
+        </w:rPr>
+        <w:t xml:space="preserve"># </w:t>
+      </w:r>
+      <w:r>
+        <w:rPr>
+          <w:sz w:val="32"/>
+          <w:szCs w:val="32"/>
+        </w:rPr>
+        <w:t>Space</w:t>
+      </w:r>
+      <w:r>
+        <w:rPr>
+          <w:sz w:val="32"/>
+          <w:szCs w:val="32"/>
+        </w:rPr>
+        <w:t xml:space="preserve"> Complexity </w:t>
+      </w:r>
+      <w:r>
+        <w:rPr>
+          <w:sz w:val="32"/>
+          <w:szCs w:val="32"/>
+        </w:rPr>
+        <w:sym w:font="Wingdings" w:char="F0E0"/>
+      </w:r>
+      <w:r>
+        <w:rPr>
+          <w:sz w:val="32"/>
+          <w:szCs w:val="32"/>
+        </w:rPr>
+        <w:t xml:space="preserve"> </w:t>
+      </w:r>
+      <w:r>
+        <w:rPr>
+          <w:sz w:val="32"/>
+          <w:szCs w:val="32"/>
+        </w:rPr>
+        <w:t>The dictionary may store every element</w:t>
+      </w:r>
+      <w:r>
+        <w:rPr>
+          <w:sz w:val="32"/>
+          <w:szCs w:val="32"/>
+        </w:rPr>
+        <w:t>:</w:t>
+      </w:r>
+    </w:p>
+    <w:p>
+      <w:pPr>
+        <w:jc w:val="both"/>
+        <w:rPr>
+          <w:b/>
+          <w:bCs/>
+          <w:sz w:val="32"/>
+          <w:szCs w:val="32"/>
+        </w:rPr>
+      </w:pPr>
+      <w:r>
+        <w:rPr>
+          <w:b/>
+          <w:bCs/>
+          <w:sz w:val="32"/>
+          <w:szCs w:val="32"/>
+        </w:rPr>
+        <w:t>O(n)</w:t>
+      </w:r>
+    </w:p>
+    <w:p>
+      <w:pPr>
+        <w:jc w:val="both"/>
+        <w:rPr>
+          <w:sz w:val="32"/>
+          <w:szCs w:val="32"/>
+        </w:rPr>
+      </w:pPr>
+    </w:p>
+    <w:p>
+      <w:pPr>
+        <w:jc w:val="both"/>
+        <w:rPr>
+          <w:sz w:val="32"/>
+          <w:szCs w:val="32"/>
+        </w:rPr>
+      </w:pPr>
+      <w:r>
+        <w:rPr>
+          <w:sz w:val="32"/>
+          <w:szCs w:val="32"/>
+        </w:rPr>
+        <w:t>Important Tools:</w:t>
+      </w:r>
+    </w:p>
+    <w:p>
+      <w:pPr>
+        <w:jc w:val="both"/>
+        <w:rPr>
+          <w:sz w:val="32"/>
+          <w:szCs w:val="32"/>
+        </w:rPr>
+      </w:pPr>
+      <w:r>
+        <w:rPr>
+          <w:sz w:val="32"/>
+          <w:szCs w:val="32"/>
+        </w:rPr>
+        <w:t># These are tools used for standard DSA:</w:t>
+      </w:r>
+    </w:p>
+    <w:p>
+      <w:pPr>
+        <w:pStyle w:val="ListParagraph"/>
+        <w:numPr>
+          <w:ilvl w:val="0"/>
+          <w:numId w:val="32"/>
+        </w:numPr>
+        <w:jc w:val="both"/>
+        <w:rPr>
+          <w:sz w:val="32"/>
+          <w:szCs w:val="32"/>
+        </w:rPr>
+      </w:pPr>
+      <w:r>
+        <w:rPr>
+          <w:sz w:val="32"/>
+          <w:szCs w:val="32"/>
+        </w:rPr>
+        <w:t>Dictionaries</w:t>
+      </w:r>
+    </w:p>
+    <w:p>
+      <w:pPr>
+        <w:pStyle w:val="ListParagraph"/>
+        <w:numPr>
+          <w:ilvl w:val="0"/>
+          <w:numId w:val="32"/>
+        </w:numPr>
+        <w:jc w:val="both"/>
+        <w:rPr>
+          <w:b/>
+          <w:bCs/>
+          <w:sz w:val="32"/>
+          <w:szCs w:val="32"/>
+        </w:rPr>
+      </w:pPr>
+      <w:r>
+        <w:rPr>
+          <w:b/>
+          <w:bCs/>
+          <w:sz w:val="32"/>
+          <w:szCs w:val="32"/>
+        </w:rPr>
+        <w:t>dict.get()</w:t>
+      </w:r>
+    </w:p>
+    <w:p>
+      <w:pPr>
+        <w:pStyle w:val="ListParagraph"/>
+        <w:numPr>
+          <w:ilvl w:val="0"/>
+          <w:numId w:val="32"/>
+        </w:numPr>
+        <w:jc w:val="both"/>
+        <w:rPr>
+          <w:sz w:val="32"/>
+          <w:szCs w:val="32"/>
+        </w:rPr>
+      </w:pPr>
+      <w:r>
+        <w:rPr>
+          <w:sz w:val="32"/>
+          <w:szCs w:val="32"/>
+        </w:rPr>
+        <w:t>Membership checks</w:t>
+      </w:r>
+      <w:r>
+        <w:rPr>
+          <w:sz w:val="32"/>
+          <w:szCs w:val="32"/>
+        </w:rPr>
+        <w:t xml:space="preserve"> in dictionary</w:t>
+      </w:r>
+      <w:r>
+        <w:rPr>
+          <w:sz w:val="32"/>
+          <w:szCs w:val="32"/>
+        </w:rPr>
+        <w:t xml:space="preserve"> </w:t>
+      </w:r>
+      <w:r>
+        <w:rPr>
+          <w:b/>
+          <w:bCs/>
+          <w:sz w:val="32"/>
+          <w:szCs w:val="32"/>
+        </w:rPr>
+        <w:t>(in</w:t>
+      </w:r>
+      <w:r>
+        <w:rPr>
+          <w:sz w:val="32"/>
+          <w:szCs w:val="32"/>
+        </w:rPr>
+        <w:t>)</w:t>
+      </w:r>
+    </w:p>
+    <w:p>
+      <w:pPr>
+        <w:pStyle w:val="ListParagraph"/>
+        <w:numPr>
+          <w:ilvl w:val="0"/>
+          <w:numId w:val="32"/>
+        </w:numPr>
+        <w:jc w:val="both"/>
+        <w:rPr>
+          <w:sz w:val="32"/>
+          <w:szCs w:val="32"/>
+        </w:rPr>
+      </w:pPr>
+      <w:r>
+        <w:rPr>
+          <w:sz w:val="32"/>
+          <w:szCs w:val="32"/>
+        </w:rPr>
+        <w:t>Lists</w:t>
+      </w:r>
+    </w:p>
+    <w:p>
+      <w:pPr>
+        <w:pStyle w:val="ListParagraph"/>
+        <w:numPr>
+          <w:ilvl w:val="0"/>
+          <w:numId w:val="32"/>
+        </w:numPr>
+        <w:jc w:val="both"/>
+        <w:rPr>
+          <w:sz w:val="32"/>
+          <w:szCs w:val="32"/>
+        </w:rPr>
+      </w:pPr>
+      <w:r>
+        <w:rPr>
+          <w:sz w:val="32"/>
+          <w:szCs w:val="32"/>
+        </w:rPr>
+        <w:t>Loops</w:t>
+      </w:r>
+    </w:p>
+    <w:p>
+      <w:pPr>
+        <w:jc w:val="both"/>
+        <w:rPr>
+          <w:sz w:val="32"/>
+          <w:szCs w:val="32"/>
+        </w:rPr>
+      </w:pPr>
+    </w:p>
+    <w:p>
+      <w:pPr>
+        <w:jc w:val="both"/>
+        <w:rPr>
+          <w:sz w:val="32"/>
+          <w:szCs w:val="32"/>
+        </w:rPr>
+      </w:pPr>
+      <w:r>
+        <w:rPr>
+          <w:sz w:val="32"/>
+          <w:szCs w:val="32"/>
+        </w:rPr>
+        <w:t>Mental Model:</w:t>
+      </w:r>
+    </w:p>
+    <w:p>
+      <w:pPr>
+        <w:jc w:val="both"/>
+        <w:rPr>
+          <w:sz w:val="32"/>
+          <w:szCs w:val="32"/>
+        </w:rPr>
+      </w:pPr>
+      <w:r>
+        <w:rPr>
+          <w:sz w:val="32"/>
+          <w:szCs w:val="32"/>
+        </w:rPr>
+        <w:t># Instead of thinking “How do I solve this?” think “What information should I remember to avoid searching again?”.</w:t>
+      </w:r>
+    </w:p>
+    <w:p>
+      <w:pPr>
+        <w:jc w:val="both"/>
+        <w:rPr>
+          <w:sz w:val="32"/>
+          <w:szCs w:val="32"/>
+        </w:rPr>
+      </w:pPr>
+      <w:r>
+        <w:rPr>
+          <w:sz w:val="32"/>
+          <w:szCs w:val="32"/>
+        </w:rPr>
+        <w:t># This shift is what algorithm design is all about</w:t>
+      </w:r>
+    </w:p>
+    <w:p>
+      <w:pPr>
+        <w:jc w:val="both"/>
+        <w:rPr>
+          <w:sz w:val="32"/>
+          <w:szCs w:val="32"/>
+        </w:rPr>
+      </w:pPr>
+    </w:p>
+    <w:p>
+      <w:pPr>
+        <w:jc w:val="both"/>
+        <w:rPr>
+          <w:sz w:val="32"/>
+          <w:szCs w:val="32"/>
+        </w:rPr>
+      </w:pPr>
+    </w:p>
+    <w:p>
+      <w:pPr>
+        <w:jc w:val="both"/>
+        <w:rPr>
+          <w:sz w:val="32"/>
+          <w:szCs w:val="32"/>
+        </w:rPr>
+      </w:pPr>
     </w:p>
     <w:sectPr>
       <w:footerReference w:type="default" r:id="rId7"/>
@@ -685,6 +2053,97 @@
 <file path=word/numbering.xml><?xml version="1.0" encoding="utf-8"?>
 <w:numbering xmlns:wpc="http://schemas.microsoft.com/office/word/2010/wordprocessingCanvas" xmlns:cx="http://schemas.microsoft.com/office/drawing/2014/chartex" xmlns:cx1="http://schemas.microsoft.com/office/drawing/2015/9/8/chartex" xmlns:cx2="http://schemas.microsoft.com/office/drawing/2015/10/21/chartex" xmlns:cx3="http://schemas.microsoft.com/office/drawing/2016/5/9/chartex" xmlns:cx4="http://schemas.microsoft.com/office/drawing/2016/5/10/chartex" xmlns:cx5="http://schemas.microsoft.com/office/drawing/2016/5/11/chartex" xmlns:cx6="http://schemas.microsoft.com/office/drawing/2016/5/12/chartex" xmlns:cx7="http://schemas.microsoft.com/office/drawing/2016/5/13/chartex" xmlns:cx8="http://schemas.microsoft.com/office/drawing/2016/5/14/chartex" xmlns:mc="http://schemas.openxmlformats.org/markup-compatibility/2006" xmlns:aink="http://schemas.microsoft.com/office/drawing/2016/ink" xmlns:am3d="http://schemas.microsoft.com/office/drawing/2017/model3d" xmlns:o="urn:schemas-microsoft-com:office:office" xmlns:oel="http://schemas.microsoft.com/office/2019/extlst" xmlns:r="http://schemas.openxmlformats.org/officeDocument/2006/relationships" xmlns:m="http://schemas.openxmlformats.org/officeDocument/2006/math" xmlns:v="urn:schemas-microsoft-com:vml" xmlns:wp14="http://schemas.microsoft.com/office/word/2010/wordprocessingDrawing" xmlns:wp="http://schemas.openxmlformats.org/drawingml/2006/wordprocessingDrawing" xmlns:w10="urn:schemas-microsoft-com:office:word" xmlns:w="http://schemas.openxmlformats.org/wordprocessingml/2006/main" xmlns:w14="http://schemas.microsoft.com/office/word/2010/wordml" xmlns:w15="http://schemas.microsoft.com/office/word/2012/wordml" xmlns:w16cex="http://schemas.microsoft.com/office/word/2018/wordml/cex" xmlns:w16cid="http://schemas.microsoft.com/office/word/2016/wordml/cid" xmlns:w16="http://schemas.microsoft.com/office/word/2018/wordml" xmlns:w16sdtdh="http://schemas.microsoft.com/office/word/2020/wordml/sdtdatahash" xmlns:w16se="http://schemas.microsoft.com/office/word/2015/wordml/symex" xmlns:wpg="http://schemas.microsoft.com/office/word/2010/wordprocessingGroup" xmlns:wpi="http://schemas.microsoft.com/office/word/2010/wordprocessingInk" xmlns:wne="http://schemas.microsoft.com/office/word/2006/wordml" xmlns:wps="http://schemas.microsoft.com/office/word/2010/wordprocessingShape" mc:Ignorable="w14 w15 w16se w16cid w16 w16cex w16sdtdh wp14">
   <w:abstractNum w:abstractNumId="0" w15:restartNumberingAfterBreak="0">
+    <w:nsid w:val="03B26373"/>
+    <w:multiLevelType w:val="hybridMultilevel"/>
+    <w:tmpl w:val="0E7C02AA"/>
+    <w:lvl w:ilvl="0" w:tplc="96969EBA">
+      <w:start w:val="1"/>
+      <w:numFmt w:val="decimal"/>
+      <w:lvlText w:val="%1."/>
+      <w:lvlJc w:val="left"/>
+      <w:pPr>
+        <w:ind w:left="360" w:hanging="360"/>
+      </w:pPr>
+      <w:rPr>
+        <w:rFonts w:hint="default"/>
+        <w:b/>
+        <w:bCs/>
+      </w:rPr>
+    </w:lvl>
+    <w:lvl w:ilvl="1" w:tplc="04090019" w:tentative="1">
+      <w:start w:val="1"/>
+      <w:numFmt w:val="lowerLetter"/>
+      <w:lvlText w:val="%2."/>
+      <w:lvlJc w:val="left"/>
+      <w:pPr>
+        <w:ind w:left="1080" w:hanging="360"/>
+      </w:pPr>
+    </w:lvl>
+    <w:lvl w:ilvl="2" w:tplc="0409001B" w:tentative="1">
+      <w:start w:val="1"/>
+      <w:numFmt w:val="lowerRoman"/>
+      <w:lvlText w:val="%3."/>
+      <w:lvlJc w:val="right"/>
+      <w:pPr>
+        <w:ind w:left="1800" w:hanging="180"/>
+      </w:pPr>
+    </w:lvl>
+    <w:lvl w:ilvl="3" w:tplc="0409000F" w:tentative="1">
+      <w:start w:val="1"/>
+      <w:numFmt w:val="decimal"/>
+      <w:lvlText w:val="%4."/>
+      <w:lvlJc w:val="left"/>
+      <w:pPr>
+        <w:ind w:left="2520" w:hanging="360"/>
+      </w:pPr>
+    </w:lvl>
+    <w:lvl w:ilvl="4" w:tplc="04090019" w:tentative="1">
+      <w:start w:val="1"/>
+      <w:numFmt w:val="lowerLetter"/>
+      <w:lvlText w:val="%5."/>
+      <w:lvlJc w:val="left"/>
+      <w:pPr>
+        <w:ind w:left="3240" w:hanging="360"/>
+      </w:pPr>
+    </w:lvl>
+    <w:lvl w:ilvl="5" w:tplc="0409001B" w:tentative="1">
+      <w:start w:val="1"/>
+      <w:numFmt w:val="lowerRoman"/>
+      <w:lvlText w:val="%6."/>
+      <w:lvlJc w:val="right"/>
+      <w:pPr>
+        <w:ind w:left="3960" w:hanging="180"/>
+      </w:pPr>
+    </w:lvl>
+    <w:lvl w:ilvl="6" w:tplc="0409000F" w:tentative="1">
+      <w:start w:val="1"/>
+      <w:numFmt w:val="decimal"/>
+      <w:lvlText w:val="%7."/>
+      <w:lvlJc w:val="left"/>
+      <w:pPr>
+        <w:ind w:left="4680" w:hanging="360"/>
+      </w:pPr>
+    </w:lvl>
+    <w:lvl w:ilvl="7" w:tplc="04090019" w:tentative="1">
+      <w:start w:val="1"/>
+      <w:numFmt w:val="lowerLetter"/>
+      <w:lvlText w:val="%8."/>
+      <w:lvlJc w:val="left"/>
+      <w:pPr>
+        <w:ind w:left="5400" w:hanging="360"/>
+      </w:pPr>
+    </w:lvl>
+    <w:lvl w:ilvl="8" w:tplc="0409001B" w:tentative="1">
+      <w:start w:val="1"/>
+      <w:numFmt w:val="lowerRoman"/>
+      <w:lvlText w:val="%9."/>
+      <w:lvlJc w:val="right"/>
+      <w:pPr>
+        <w:ind w:left="6120" w:hanging="180"/>
+      </w:pPr>
+    </w:lvl>
+  </w:abstractNum>
+  <w:abstractNum w:abstractNumId="1" w15:restartNumberingAfterBreak="0">
     <w:nsid w:val="07FF6E1F"/>
     <w:multiLevelType w:val="hybridMultilevel"/>
     <w:tmpl w:val="BE845D3E"/>
@@ -797,7 +2256,7 @@
       </w:rPr>
     </w:lvl>
   </w:abstractNum>
-  <w:abstractNum w:abstractNumId="1" w15:restartNumberingAfterBreak="0">
+  <w:abstractNum w:abstractNumId="2" w15:restartNumberingAfterBreak="0">
     <w:nsid w:val="10A42389"/>
     <w:multiLevelType w:val="hybridMultilevel"/>
     <w:tmpl w:val="1082B6A4"/>
@@ -910,7 +2369,7 @@
       </w:rPr>
     </w:lvl>
   </w:abstractNum>
-  <w:abstractNum w:abstractNumId="2" w15:restartNumberingAfterBreak="0">
+  <w:abstractNum w:abstractNumId="3" w15:restartNumberingAfterBreak="0">
     <w:nsid w:val="138C063B"/>
     <w:multiLevelType w:val="hybridMultilevel"/>
     <w:tmpl w:val="7BACD71C"/>
@@ -1023,7 +2482,7 @@
       </w:rPr>
     </w:lvl>
   </w:abstractNum>
-  <w:abstractNum w:abstractNumId="3" w15:restartNumberingAfterBreak="0">
+  <w:abstractNum w:abstractNumId="4" w15:restartNumberingAfterBreak="0">
     <w:nsid w:val="1E9323AD"/>
     <w:multiLevelType w:val="hybridMultilevel"/>
     <w:tmpl w:val="B4A0E43E"/>
@@ -1136,7 +2595,7 @@
       </w:rPr>
     </w:lvl>
   </w:abstractNum>
-  <w:abstractNum w:abstractNumId="4" w15:restartNumberingAfterBreak="0">
+  <w:abstractNum w:abstractNumId="5" w15:restartNumberingAfterBreak="0">
     <w:nsid w:val="23A11734"/>
     <w:multiLevelType w:val="hybridMultilevel"/>
     <w:tmpl w:val="CCB83A46"/>
@@ -1249,7 +2708,7 @@
       </w:rPr>
     </w:lvl>
   </w:abstractNum>
-  <w:abstractNum w:abstractNumId="5" w15:restartNumberingAfterBreak="0">
+  <w:abstractNum w:abstractNumId="6" w15:restartNumberingAfterBreak="0">
     <w:nsid w:val="2557343A"/>
     <w:multiLevelType w:val="hybridMultilevel"/>
     <w:tmpl w:val="8A30FEE6"/>
@@ -1362,7 +2821,7 @@
       </w:rPr>
     </w:lvl>
   </w:abstractNum>
-  <w:abstractNum w:abstractNumId="6" w15:restartNumberingAfterBreak="0">
+  <w:abstractNum w:abstractNumId="7" w15:restartNumberingAfterBreak="0">
     <w:nsid w:val="2803370B"/>
     <w:multiLevelType w:val="hybridMultilevel"/>
     <w:tmpl w:val="9EA49456"/>
@@ -1475,7 +2934,7 @@
       </w:rPr>
     </w:lvl>
   </w:abstractNum>
-  <w:abstractNum w:abstractNumId="7" w15:restartNumberingAfterBreak="0">
+  <w:abstractNum w:abstractNumId="8" w15:restartNumberingAfterBreak="0">
     <w:nsid w:val="2E007351"/>
     <w:multiLevelType w:val="hybridMultilevel"/>
     <w:tmpl w:val="6F2EBE88"/>
@@ -1588,7 +3047,7 @@
       </w:rPr>
     </w:lvl>
   </w:abstractNum>
-  <w:abstractNum w:abstractNumId="8" w15:restartNumberingAfterBreak="0">
+  <w:abstractNum w:abstractNumId="9" w15:restartNumberingAfterBreak="0">
     <w:nsid w:val="2F592B5B"/>
     <w:multiLevelType w:val="hybridMultilevel"/>
     <w:tmpl w:val="FE62C13A"/>
@@ -1701,7 +3160,7 @@
       </w:rPr>
     </w:lvl>
   </w:abstractNum>
-  <w:abstractNum w:abstractNumId="9" w15:restartNumberingAfterBreak="0">
+  <w:abstractNum w:abstractNumId="10" w15:restartNumberingAfterBreak="0">
     <w:nsid w:val="343F15CA"/>
     <w:multiLevelType w:val="hybridMultilevel"/>
     <w:tmpl w:val="38905CBE"/>
@@ -1814,7 +3273,7 @@
       </w:rPr>
     </w:lvl>
   </w:abstractNum>
-  <w:abstractNum w:abstractNumId="10" w15:restartNumberingAfterBreak="0">
+  <w:abstractNum w:abstractNumId="11" w15:restartNumberingAfterBreak="0">
     <w:nsid w:val="352E72A6"/>
     <w:multiLevelType w:val="hybridMultilevel"/>
     <w:tmpl w:val="36608DA2"/>
@@ -1927,7 +3386,7 @@
       </w:rPr>
     </w:lvl>
   </w:abstractNum>
-  <w:abstractNum w:abstractNumId="11" w15:restartNumberingAfterBreak="0">
+  <w:abstractNum w:abstractNumId="12" w15:restartNumberingAfterBreak="0">
     <w:nsid w:val="3A64427A"/>
     <w:multiLevelType w:val="hybridMultilevel"/>
     <w:tmpl w:val="08061F78"/>
@@ -2040,7 +3499,7 @@
       </w:rPr>
     </w:lvl>
   </w:abstractNum>
-  <w:abstractNum w:abstractNumId="12" w15:restartNumberingAfterBreak="0">
+  <w:abstractNum w:abstractNumId="13" w15:restartNumberingAfterBreak="0">
     <w:nsid w:val="3B0B59EE"/>
     <w:multiLevelType w:val="hybridMultilevel"/>
     <w:tmpl w:val="A9A007C4"/>
@@ -2153,7 +3612,7 @@
       </w:rPr>
     </w:lvl>
   </w:abstractNum>
-  <w:abstractNum w:abstractNumId="13" w15:restartNumberingAfterBreak="0">
+  <w:abstractNum w:abstractNumId="14" w15:restartNumberingAfterBreak="0">
     <w:nsid w:val="3CE6114A"/>
     <w:multiLevelType w:val="hybridMultilevel"/>
     <w:tmpl w:val="DAC8EAB2"/>
@@ -2266,7 +3725,7 @@
       </w:rPr>
     </w:lvl>
   </w:abstractNum>
-  <w:abstractNum w:abstractNumId="14" w15:restartNumberingAfterBreak="0">
+  <w:abstractNum w:abstractNumId="15" w15:restartNumberingAfterBreak="0">
     <w:nsid w:val="3EA15ED3"/>
     <w:multiLevelType w:val="hybridMultilevel"/>
     <w:tmpl w:val="32A66580"/>
@@ -2379,7 +3838,7 @@
       </w:rPr>
     </w:lvl>
   </w:abstractNum>
-  <w:abstractNum w:abstractNumId="15" w15:restartNumberingAfterBreak="0">
+  <w:abstractNum w:abstractNumId="16" w15:restartNumberingAfterBreak="0">
     <w:nsid w:val="434167F6"/>
     <w:multiLevelType w:val="hybridMultilevel"/>
     <w:tmpl w:val="17709D4E"/>
@@ -2492,7 +3951,7 @@
       </w:rPr>
     </w:lvl>
   </w:abstractNum>
-  <w:abstractNum w:abstractNumId="16" w15:restartNumberingAfterBreak="0">
+  <w:abstractNum w:abstractNumId="17" w15:restartNumberingAfterBreak="0">
     <w:nsid w:val="465D0ED0"/>
     <w:multiLevelType w:val="hybridMultilevel"/>
     <w:tmpl w:val="CA2CA59C"/>
@@ -2605,7 +4064,7 @@
       </w:rPr>
     </w:lvl>
   </w:abstractNum>
-  <w:abstractNum w:abstractNumId="17" w15:restartNumberingAfterBreak="0">
+  <w:abstractNum w:abstractNumId="18" w15:restartNumberingAfterBreak="0">
     <w:nsid w:val="48BC2A2E"/>
     <w:multiLevelType w:val="hybridMultilevel"/>
     <w:tmpl w:val="262A606E"/>
@@ -2696,7 +4155,7 @@
       </w:pPr>
     </w:lvl>
   </w:abstractNum>
-  <w:abstractNum w:abstractNumId="18" w15:restartNumberingAfterBreak="0">
+  <w:abstractNum w:abstractNumId="19" w15:restartNumberingAfterBreak="0">
     <w:nsid w:val="49767D6F"/>
     <w:multiLevelType w:val="hybridMultilevel"/>
     <w:tmpl w:val="4218F1BC"/>
@@ -2787,7 +4246,7 @@
       </w:pPr>
     </w:lvl>
   </w:abstractNum>
-  <w:abstractNum w:abstractNumId="19" w15:restartNumberingAfterBreak="0">
+  <w:abstractNum w:abstractNumId="20" w15:restartNumberingAfterBreak="0">
     <w:nsid w:val="4A3641F2"/>
     <w:multiLevelType w:val="hybridMultilevel"/>
     <w:tmpl w:val="55A4C6E8"/>
@@ -2900,7 +4359,7 @@
       </w:rPr>
     </w:lvl>
   </w:abstractNum>
-  <w:abstractNum w:abstractNumId="20" w15:restartNumberingAfterBreak="0">
+  <w:abstractNum w:abstractNumId="21" w15:restartNumberingAfterBreak="0">
     <w:nsid w:val="4FB51FC8"/>
     <w:multiLevelType w:val="hybridMultilevel"/>
     <w:tmpl w:val="C10C9EF6"/>
@@ -3013,7 +4472,7 @@
       </w:rPr>
     </w:lvl>
   </w:abstractNum>
-  <w:abstractNum w:abstractNumId="21" w15:restartNumberingAfterBreak="0">
+  <w:abstractNum w:abstractNumId="22" w15:restartNumberingAfterBreak="0">
     <w:nsid w:val="51D943C0"/>
     <w:multiLevelType w:val="hybridMultilevel"/>
     <w:tmpl w:val="AACCBFFC"/>
@@ -3126,7 +4585,7 @@
       </w:rPr>
     </w:lvl>
   </w:abstractNum>
-  <w:abstractNum w:abstractNumId="22" w15:restartNumberingAfterBreak="0">
+  <w:abstractNum w:abstractNumId="23" w15:restartNumberingAfterBreak="0">
     <w:nsid w:val="566B2156"/>
     <w:multiLevelType w:val="hybridMultilevel"/>
     <w:tmpl w:val="49A48358"/>
@@ -3239,7 +4698,7 @@
       </w:rPr>
     </w:lvl>
   </w:abstractNum>
-  <w:abstractNum w:abstractNumId="23" w15:restartNumberingAfterBreak="0">
+  <w:abstractNum w:abstractNumId="24" w15:restartNumberingAfterBreak="0">
     <w:nsid w:val="6574689A"/>
     <w:multiLevelType w:val="hybridMultilevel"/>
     <w:tmpl w:val="3040723C"/>
@@ -3352,7 +4811,7 @@
       </w:rPr>
     </w:lvl>
   </w:abstractNum>
-  <w:abstractNum w:abstractNumId="24" w15:restartNumberingAfterBreak="0">
+  <w:abstractNum w:abstractNumId="25" w15:restartNumberingAfterBreak="0">
     <w:nsid w:val="68152F36"/>
     <w:multiLevelType w:val="hybridMultilevel"/>
     <w:tmpl w:val="C42ED464"/>
@@ -3465,7 +4924,7 @@
       </w:rPr>
     </w:lvl>
   </w:abstractNum>
-  <w:abstractNum w:abstractNumId="25" w15:restartNumberingAfterBreak="0">
+  <w:abstractNum w:abstractNumId="26" w15:restartNumberingAfterBreak="0">
     <w:nsid w:val="684E54B5"/>
     <w:multiLevelType w:val="hybridMultilevel"/>
     <w:tmpl w:val="E238318E"/>
@@ -3578,7 +5037,7 @@
       </w:rPr>
     </w:lvl>
   </w:abstractNum>
-  <w:abstractNum w:abstractNumId="26" w15:restartNumberingAfterBreak="0">
+  <w:abstractNum w:abstractNumId="27" w15:restartNumberingAfterBreak="0">
     <w:nsid w:val="68F2565C"/>
     <w:multiLevelType w:val="hybridMultilevel"/>
     <w:tmpl w:val="8D324286"/>
@@ -3691,7 +5150,120 @@
       </w:rPr>
     </w:lvl>
   </w:abstractNum>
-  <w:abstractNum w:abstractNumId="27" w15:restartNumberingAfterBreak="0">
+  <w:abstractNum w:abstractNumId="28" w15:restartNumberingAfterBreak="0">
+    <w:nsid w:val="6F1C47F5"/>
+    <w:multiLevelType w:val="hybridMultilevel"/>
+    <w:tmpl w:val="41E69716"/>
+    <w:lvl w:ilvl="0" w:tplc="04090001">
+      <w:start w:val="1"/>
+      <w:numFmt w:val="bullet"/>
+      <w:lvlText w:val=""/>
+      <w:lvlJc w:val="left"/>
+      <w:pPr>
+        <w:ind w:left="360" w:hanging="360"/>
+      </w:pPr>
+      <w:rPr>
+        <w:rFonts w:ascii="Symbol" w:hAnsi="Symbol" w:hint="default"/>
+      </w:rPr>
+    </w:lvl>
+    <w:lvl w:ilvl="1" w:tplc="04090003" w:tentative="1">
+      <w:start w:val="1"/>
+      <w:numFmt w:val="bullet"/>
+      <w:lvlText w:val="o"/>
+      <w:lvlJc w:val="left"/>
+      <w:pPr>
+        <w:ind w:left="1080" w:hanging="360"/>
+      </w:pPr>
+      <w:rPr>
+        <w:rFonts w:ascii="Courier New" w:hAnsi="Courier New" w:cs="Courier New" w:hint="default"/>
+      </w:rPr>
+    </w:lvl>
+    <w:lvl w:ilvl="2" w:tplc="04090005" w:tentative="1">
+      <w:start w:val="1"/>
+      <w:numFmt w:val="bullet"/>
+      <w:lvlText w:val=""/>
+      <w:lvlJc w:val="left"/>
+      <w:pPr>
+        <w:ind w:left="1800" w:hanging="360"/>
+      </w:pPr>
+      <w:rPr>
+        <w:rFonts w:ascii="Wingdings" w:hAnsi="Wingdings" w:hint="default"/>
+      </w:rPr>
+    </w:lvl>
+    <w:lvl w:ilvl="3" w:tplc="04090001" w:tentative="1">
+      <w:start w:val="1"/>
+      <w:numFmt w:val="bullet"/>
+      <w:lvlText w:val=""/>
+      <w:lvlJc w:val="left"/>
+      <w:pPr>
+        <w:ind w:left="2520" w:hanging="360"/>
+      </w:pPr>
+      <w:rPr>
+        <w:rFonts w:ascii="Symbol" w:hAnsi="Symbol" w:hint="default"/>
+      </w:rPr>
+    </w:lvl>
+    <w:lvl w:ilvl="4" w:tplc="04090003" w:tentative="1">
+      <w:start w:val="1"/>
+      <w:numFmt w:val="bullet"/>
+      <w:lvlText w:val="o"/>
+      <w:lvlJc w:val="left"/>
+      <w:pPr>
+        <w:ind w:left="3240" w:hanging="360"/>
+      </w:pPr>
+      <w:rPr>
+        <w:rFonts w:ascii="Courier New" w:hAnsi="Courier New" w:cs="Courier New" w:hint="default"/>
+      </w:rPr>
+    </w:lvl>
+    <w:lvl w:ilvl="5" w:tplc="04090005" w:tentative="1">
+      <w:start w:val="1"/>
+      <w:numFmt w:val="bullet"/>
+      <w:lvlText w:val=""/>
+      <w:lvlJc w:val="left"/>
+      <w:pPr>
+        <w:ind w:left="3960" w:hanging="360"/>
+      </w:pPr>
+      <w:rPr>
+        <w:rFonts w:ascii="Wingdings" w:hAnsi="Wingdings" w:hint="default"/>
+      </w:rPr>
+    </w:lvl>
+    <w:lvl w:ilvl="6" w:tplc="04090001" w:tentative="1">
+      <w:start w:val="1"/>
+      <w:numFmt w:val="bullet"/>
+      <w:lvlText w:val=""/>
+      <w:lvlJc w:val="left"/>
+      <w:pPr>
+        <w:ind w:left="4680" w:hanging="360"/>
+      </w:pPr>
+      <w:rPr>
+        <w:rFonts w:ascii="Symbol" w:hAnsi="Symbol" w:hint="default"/>
+      </w:rPr>
+    </w:lvl>
+    <w:lvl w:ilvl="7" w:tplc="04090003" w:tentative="1">
+      <w:start w:val="1"/>
+      <w:numFmt w:val="bullet"/>
+      <w:lvlText w:val="o"/>
+      <w:lvlJc w:val="left"/>
+      <w:pPr>
+        <w:ind w:left="5400" w:hanging="360"/>
+      </w:pPr>
+      <w:rPr>
+        <w:rFonts w:ascii="Courier New" w:hAnsi="Courier New" w:cs="Courier New" w:hint="default"/>
+      </w:rPr>
+    </w:lvl>
+    <w:lvl w:ilvl="8" w:tplc="04090005" w:tentative="1">
+      <w:start w:val="1"/>
+      <w:numFmt w:val="bullet"/>
+      <w:lvlText w:val=""/>
+      <w:lvlJc w:val="left"/>
+      <w:pPr>
+        <w:ind w:left="6120" w:hanging="360"/>
+      </w:pPr>
+      <w:rPr>
+        <w:rFonts w:ascii="Wingdings" w:hAnsi="Wingdings" w:hint="default"/>
+      </w:rPr>
+    </w:lvl>
+  </w:abstractNum>
+  <w:abstractNum w:abstractNumId="29" w15:restartNumberingAfterBreak="0">
     <w:nsid w:val="6F9908ED"/>
     <w:multiLevelType w:val="hybridMultilevel"/>
     <w:tmpl w:val="19A64D52"/>
@@ -3804,7 +5376,7 @@
       </w:rPr>
     </w:lvl>
   </w:abstractNum>
-  <w:abstractNum w:abstractNumId="28" w15:restartNumberingAfterBreak="0">
+  <w:abstractNum w:abstractNumId="30" w15:restartNumberingAfterBreak="0">
     <w:nsid w:val="73EF6507"/>
     <w:multiLevelType w:val="hybridMultilevel"/>
     <w:tmpl w:val="CB3EB4AA"/>
@@ -3895,7 +5467,7 @@
       </w:pPr>
     </w:lvl>
   </w:abstractNum>
-  <w:abstractNum w:abstractNumId="29" w15:restartNumberingAfterBreak="0">
+  <w:abstractNum w:abstractNumId="31" w15:restartNumberingAfterBreak="0">
     <w:nsid w:val="77931365"/>
     <w:multiLevelType w:val="hybridMultilevel"/>
     <w:tmpl w:val="5C26A464"/>
@@ -4008,7 +5580,7 @@
       </w:rPr>
     </w:lvl>
   </w:abstractNum>
-  <w:abstractNum w:abstractNumId="30" w15:restartNumberingAfterBreak="0">
+  <w:abstractNum w:abstractNumId="32" w15:restartNumberingAfterBreak="0">
     <w:nsid w:val="7B9E3FA6"/>
     <w:multiLevelType w:val="hybridMultilevel"/>
     <w:tmpl w:val="6F8231C2"/>
@@ -4122,97 +5694,103 @@
     </w:lvl>
   </w:abstractNum>
   <w:num w:numId="1" w16cid:durableId="664865304">
+    <w:abstractNumId w:val="24"/>
+  </w:num>
+  <w:num w:numId="2" w16cid:durableId="2008902027">
+    <w:abstractNumId w:val="11"/>
+  </w:num>
+  <w:num w:numId="3" w16cid:durableId="704447734">
+    <w:abstractNumId w:val="31"/>
+  </w:num>
+  <w:num w:numId="4" w16cid:durableId="1510021272">
+    <w:abstractNumId w:val="9"/>
+  </w:num>
+  <w:num w:numId="5" w16cid:durableId="359281728">
+    <w:abstractNumId w:val="18"/>
+  </w:num>
+  <w:num w:numId="6" w16cid:durableId="259992389">
+    <w:abstractNumId w:val="14"/>
+  </w:num>
+  <w:num w:numId="7" w16cid:durableId="202402556">
+    <w:abstractNumId w:val="6"/>
+  </w:num>
+  <w:num w:numId="8" w16cid:durableId="879320700">
+    <w:abstractNumId w:val="2"/>
+  </w:num>
+  <w:num w:numId="9" w16cid:durableId="1021131634">
     <w:abstractNumId w:val="23"/>
   </w:num>
-  <w:num w:numId="2" w16cid:durableId="2008902027">
+  <w:num w:numId="10" w16cid:durableId="1837186236">
+    <w:abstractNumId w:val="20"/>
+  </w:num>
+  <w:num w:numId="11" w16cid:durableId="480124734">
+    <w:abstractNumId w:val="19"/>
+  </w:num>
+  <w:num w:numId="12" w16cid:durableId="1120107619">
+    <w:abstractNumId w:val="15"/>
+  </w:num>
+  <w:num w:numId="13" w16cid:durableId="2129663888">
+    <w:abstractNumId w:val="5"/>
+  </w:num>
+  <w:num w:numId="14" w16cid:durableId="1609662036">
+    <w:abstractNumId w:val="12"/>
+  </w:num>
+  <w:num w:numId="15" w16cid:durableId="473985100">
+    <w:abstractNumId w:val="30"/>
+  </w:num>
+  <w:num w:numId="16" w16cid:durableId="619263971">
+    <w:abstractNumId w:val="8"/>
+  </w:num>
+  <w:num w:numId="17" w16cid:durableId="1712536812">
+    <w:abstractNumId w:val="27"/>
+  </w:num>
+  <w:num w:numId="18" w16cid:durableId="553348773">
+    <w:abstractNumId w:val="29"/>
+  </w:num>
+  <w:num w:numId="19" w16cid:durableId="616566803">
+    <w:abstractNumId w:val="26"/>
+  </w:num>
+  <w:num w:numId="20" w16cid:durableId="1195458330">
+    <w:abstractNumId w:val="1"/>
+  </w:num>
+  <w:num w:numId="21" w16cid:durableId="979728643">
+    <w:abstractNumId w:val="17"/>
+  </w:num>
+  <w:num w:numId="22" w16cid:durableId="1781026175">
+    <w:abstractNumId w:val="22"/>
+  </w:num>
+  <w:num w:numId="23" w16cid:durableId="1358390278">
+    <w:abstractNumId w:val="3"/>
+  </w:num>
+  <w:num w:numId="24" w16cid:durableId="319967696">
+    <w:abstractNumId w:val="21"/>
+  </w:num>
+  <w:num w:numId="25" w16cid:durableId="1490172335">
     <w:abstractNumId w:val="10"/>
   </w:num>
-  <w:num w:numId="3" w16cid:durableId="704447734">
-    <w:abstractNumId w:val="29"/>
+  <w:num w:numId="26" w16cid:durableId="494876458">
+    <w:abstractNumId w:val="32"/>
   </w:num>
-  <w:num w:numId="4" w16cid:durableId="1510021272">
-    <w:abstractNumId w:val="8"/>
+  <w:num w:numId="27" w16cid:durableId="965160156">
+    <w:abstractNumId w:val="7"/>
   </w:num>
-  <w:num w:numId="5" w16cid:durableId="359281728">
-    <w:abstractNumId w:val="17"/>
+  <w:num w:numId="28" w16cid:durableId="2104494634">
+    <w:abstractNumId w:val="4"/>
   </w:num>
-  <w:num w:numId="6" w16cid:durableId="259992389">
+  <w:num w:numId="29" w16cid:durableId="1588465180">
+    <w:abstractNumId w:val="25"/>
+  </w:num>
+  <w:num w:numId="30" w16cid:durableId="727455599">
     <w:abstractNumId w:val="13"/>
   </w:num>
-  <w:num w:numId="7" w16cid:durableId="202402556">
-    <w:abstractNumId w:val="5"/>
+  <w:num w:numId="31" w16cid:durableId="1486900710">
+    <w:abstractNumId w:val="16"/>
   </w:num>
-  <w:num w:numId="8" w16cid:durableId="879320700">
-    <w:abstractNumId w:val="1"/>
-  </w:num>
-  <w:num w:numId="9" w16cid:durableId="1021131634">
-    <w:abstractNumId w:val="22"/>
-  </w:num>
-  <w:num w:numId="10" w16cid:durableId="1837186236">
-    <w:abstractNumId w:val="19"/>
-  </w:num>
-  <w:num w:numId="11" w16cid:durableId="480124734">
-    <w:abstractNumId w:val="18"/>
-  </w:num>
-  <w:num w:numId="12" w16cid:durableId="1120107619">
-    <w:abstractNumId w:val="14"/>
-  </w:num>
-  <w:num w:numId="13" w16cid:durableId="2129663888">
-    <w:abstractNumId w:val="4"/>
-  </w:num>
-  <w:num w:numId="14" w16cid:durableId="1609662036">
-    <w:abstractNumId w:val="11"/>
-  </w:num>
-  <w:num w:numId="15" w16cid:durableId="473985100">
+  <w:num w:numId="32" w16cid:durableId="1109591766">
     <w:abstractNumId w:val="28"/>
   </w:num>
-  <w:num w:numId="16" w16cid:durableId="619263971">
-    <w:abstractNumId w:val="7"/>
-  </w:num>
-  <w:num w:numId="17" w16cid:durableId="1712536812">
-    <w:abstractNumId w:val="26"/>
-  </w:num>
-  <w:num w:numId="18" w16cid:durableId="553348773">
-    <w:abstractNumId w:val="27"/>
-  </w:num>
-  <w:num w:numId="19" w16cid:durableId="616566803">
-    <w:abstractNumId w:val="25"/>
-  </w:num>
-  <w:num w:numId="20" w16cid:durableId="1195458330">
+  <w:num w:numId="33" w16cid:durableId="244725603">
     <w:abstractNumId w:val="0"/>
-  </w:num>
-  <w:num w:numId="21" w16cid:durableId="979728643">
-    <w:abstractNumId w:val="16"/>
-  </w:num>
-  <w:num w:numId="22" w16cid:durableId="1781026175">
-    <w:abstractNumId w:val="21"/>
-  </w:num>
-  <w:num w:numId="23" w16cid:durableId="1358390278">
-    <w:abstractNumId w:val="2"/>
-  </w:num>
-  <w:num w:numId="24" w16cid:durableId="319967696">
-    <w:abstractNumId w:val="20"/>
-  </w:num>
-  <w:num w:numId="25" w16cid:durableId="1490172335">
-    <w:abstractNumId w:val="9"/>
-  </w:num>
-  <w:num w:numId="26" w16cid:durableId="494876458">
-    <w:abstractNumId w:val="30"/>
-  </w:num>
-  <w:num w:numId="27" w16cid:durableId="965160156">
-    <w:abstractNumId w:val="6"/>
-  </w:num>
-  <w:num w:numId="28" w16cid:durableId="2104494634">
-    <w:abstractNumId w:val="3"/>
-  </w:num>
-  <w:num w:numId="29" w16cid:durableId="1588465180">
-    <w:abstractNumId w:val="24"/>
-  </w:num>
-  <w:num w:numId="30" w16cid:durableId="727455599">
-    <w:abstractNumId w:val="12"/>
-  </w:num>
-  <w:num w:numId="31" w16cid:durableId="1486900710">
-    <w:abstractNumId w:val="15"/>
   </w:num>
 </w:numbering>
 </file>
@@ -4820,7 +6398,6 @@
   <w:style w:type="character" w:default="1" w:styleId="DefaultParagraphFont">
     <w:name w:val="Default Paragraph Font"/>
     <w:uiPriority w:val="1"/>
-    <w:semiHidden/>
     <w:unhideWhenUsed/>
   </w:style>
   <w:style w:type="table" w:default="1" w:styleId="TableNormal">

</xml_diff>

<commit_message>
Added Two pointer pattern in DSA
</commit_message>
<xml_diff>
--- a/programming_mental_models/p4_problem_solving_and_dsa_mental_models.docx
+++ b/programming_mental_models/p4_problem_solving_and_dsa_mental_models.docx
@@ -94,6 +94,36 @@
     </w:p>
     <w:p>
       <w:pPr>
+        <w:pStyle w:val="ListParagraph"/>
+        <w:numPr>
+          <w:ilvl w:val="0"/>
+          <w:numId w:val="33"/>
+        </w:numPr>
+        <w:jc w:val="both"/>
+        <w:rPr>
+          <w:sz w:val="32"/>
+          <w:szCs w:val="32"/>
+        </w:rPr>
+      </w:pPr>
+      <w:r>
+        <w:rPr>
+          <w:sz w:val="32"/>
+          <w:szCs w:val="32"/>
+        </w:rPr>
+        <w:t>Two Pointer Pattern for Palindrome………………………………</w:t>
+      </w:r>
+      <w:proofErr w:type="gramStart"/>
+      <w:r>
+        <w:rPr>
+          <w:sz w:val="32"/>
+          <w:szCs w:val="32"/>
+        </w:rPr>
+        <w:t>…..</w:t>
+      </w:r>
+      <w:proofErr w:type="gramEnd"/>
+    </w:p>
+    <w:p>
+      <w:pPr>
         <w:jc w:val="both"/>
         <w:rPr>
           <w:sz w:val="32"/>
@@ -1328,6 +1358,474 @@
           <w:sz w:val="32"/>
           <w:szCs w:val="32"/>
         </w:rPr>
+        <w:t>Code:</w:t>
+      </w:r>
+    </w:p>
+    <w:p>
+      <w:pPr>
+        <w:jc w:val="both"/>
+        <w:rPr>
+          <w:b/>
+          <w:bCs/>
+          <w:color w:val="D86DCB" w:themeColor="accent5" w:themeTint="99"/>
+          <w:sz w:val="32"/>
+          <w:szCs w:val="32"/>
+        </w:rPr>
+      </w:pPr>
+      <w:proofErr w:type="spellStart"/>
+      <w:r>
+        <w:rPr>
+          <w:b/>
+          <w:bCs/>
+          <w:color w:val="D86DCB" w:themeColor="accent5" w:themeTint="99"/>
+          <w:sz w:val="32"/>
+          <w:szCs w:val="32"/>
+        </w:rPr>
+        <w:t>nums</w:t>
+      </w:r>
+      <w:proofErr w:type="spellEnd"/>
+      <w:r>
+        <w:rPr>
+          <w:b/>
+          <w:bCs/>
+          <w:color w:val="D86DCB" w:themeColor="accent5" w:themeTint="99"/>
+          <w:sz w:val="32"/>
+          <w:szCs w:val="32"/>
+        </w:rPr>
+        <w:t xml:space="preserve"> = [2, 7, 11, 15]</w:t>
+      </w:r>
+    </w:p>
+    <w:p>
+      <w:pPr>
+        <w:jc w:val="both"/>
+        <w:rPr>
+          <w:b/>
+          <w:bCs/>
+          <w:color w:val="D86DCB" w:themeColor="accent5" w:themeTint="99"/>
+          <w:sz w:val="32"/>
+          <w:szCs w:val="32"/>
+        </w:rPr>
+      </w:pPr>
+      <w:r>
+        <w:rPr>
+          <w:b/>
+          <w:bCs/>
+          <w:color w:val="D86DCB" w:themeColor="accent5" w:themeTint="99"/>
+          <w:sz w:val="32"/>
+          <w:szCs w:val="32"/>
+        </w:rPr>
+        <w:t>target = 9</w:t>
+      </w:r>
+    </w:p>
+    <w:p>
+      <w:pPr>
+        <w:jc w:val="both"/>
+        <w:rPr>
+          <w:b/>
+          <w:bCs/>
+          <w:color w:val="D86DCB" w:themeColor="accent5" w:themeTint="99"/>
+          <w:sz w:val="32"/>
+          <w:szCs w:val="32"/>
+        </w:rPr>
+      </w:pPr>
+      <w:r>
+        <w:rPr>
+          <w:b/>
+          <w:bCs/>
+          <w:color w:val="D86DCB" w:themeColor="accent5" w:themeTint="99"/>
+          <w:sz w:val="32"/>
+          <w:szCs w:val="32"/>
+        </w:rPr>
+        <w:t>seen = {}</w:t>
+      </w:r>
+    </w:p>
+    <w:p>
+      <w:pPr>
+        <w:jc w:val="both"/>
+        <w:rPr>
+          <w:b/>
+          <w:bCs/>
+          <w:color w:val="D86DCB" w:themeColor="accent5" w:themeTint="99"/>
+          <w:sz w:val="32"/>
+          <w:szCs w:val="32"/>
+        </w:rPr>
+      </w:pPr>
+      <w:r>
+        <w:rPr>
+          <w:b/>
+          <w:bCs/>
+          <w:color w:val="D86DCB" w:themeColor="accent5" w:themeTint="99"/>
+          <w:sz w:val="32"/>
+          <w:szCs w:val="32"/>
+        </w:rPr>
+        <w:t xml:space="preserve">for </w:t>
+      </w:r>
+      <w:proofErr w:type="spellStart"/>
+      <w:r>
+        <w:rPr>
+          <w:b/>
+          <w:bCs/>
+          <w:color w:val="D86DCB" w:themeColor="accent5" w:themeTint="99"/>
+          <w:sz w:val="32"/>
+          <w:szCs w:val="32"/>
+        </w:rPr>
+        <w:t>i</w:t>
+      </w:r>
+      <w:proofErr w:type="spellEnd"/>
+      <w:r>
+        <w:rPr>
+          <w:b/>
+          <w:bCs/>
+          <w:color w:val="D86DCB" w:themeColor="accent5" w:themeTint="99"/>
+          <w:sz w:val="32"/>
+          <w:szCs w:val="32"/>
+        </w:rPr>
+        <w:t xml:space="preserve"> in range(</w:t>
+      </w:r>
+      <w:proofErr w:type="spellStart"/>
+      <w:r>
+        <w:rPr>
+          <w:b/>
+          <w:bCs/>
+          <w:color w:val="D86DCB" w:themeColor="accent5" w:themeTint="99"/>
+          <w:sz w:val="32"/>
+          <w:szCs w:val="32"/>
+        </w:rPr>
+        <w:t>len</w:t>
+      </w:r>
+      <w:proofErr w:type="spellEnd"/>
+      <w:r>
+        <w:rPr>
+          <w:b/>
+          <w:bCs/>
+          <w:color w:val="D86DCB" w:themeColor="accent5" w:themeTint="99"/>
+          <w:sz w:val="32"/>
+          <w:szCs w:val="32"/>
+        </w:rPr>
+        <w:t>(</w:t>
+      </w:r>
+      <w:proofErr w:type="spellStart"/>
+      <w:r>
+        <w:rPr>
+          <w:b/>
+          <w:bCs/>
+          <w:color w:val="D86DCB" w:themeColor="accent5" w:themeTint="99"/>
+          <w:sz w:val="32"/>
+          <w:szCs w:val="32"/>
+        </w:rPr>
+        <w:t>nums</w:t>
+      </w:r>
+      <w:proofErr w:type="spellEnd"/>
+      <w:r>
+        <w:rPr>
+          <w:b/>
+          <w:bCs/>
+          <w:color w:val="D86DCB" w:themeColor="accent5" w:themeTint="99"/>
+          <w:sz w:val="32"/>
+          <w:szCs w:val="32"/>
+        </w:rPr>
+        <w:t>)):</w:t>
+      </w:r>
+    </w:p>
+    <w:p>
+      <w:pPr>
+        <w:jc w:val="both"/>
+        <w:rPr>
+          <w:b/>
+          <w:bCs/>
+          <w:color w:val="D86DCB" w:themeColor="accent5" w:themeTint="99"/>
+          <w:sz w:val="32"/>
+          <w:szCs w:val="32"/>
+        </w:rPr>
+      </w:pPr>
+      <w:r>
+        <w:rPr>
+          <w:b/>
+          <w:bCs/>
+          <w:color w:val="D86DCB" w:themeColor="accent5" w:themeTint="99"/>
+          <w:sz w:val="32"/>
+          <w:szCs w:val="32"/>
+        </w:rPr>
+        <w:t xml:space="preserve">    needed = target - </w:t>
+      </w:r>
+      <w:proofErr w:type="spellStart"/>
+      <w:r>
+        <w:rPr>
+          <w:b/>
+          <w:bCs/>
+          <w:color w:val="D86DCB" w:themeColor="accent5" w:themeTint="99"/>
+          <w:sz w:val="32"/>
+          <w:szCs w:val="32"/>
+        </w:rPr>
+        <w:t>nums</w:t>
+      </w:r>
+      <w:proofErr w:type="spellEnd"/>
+      <w:r>
+        <w:rPr>
+          <w:b/>
+          <w:bCs/>
+          <w:color w:val="D86DCB" w:themeColor="accent5" w:themeTint="99"/>
+          <w:sz w:val="32"/>
+          <w:szCs w:val="32"/>
+        </w:rPr>
+        <w:t>[</w:t>
+      </w:r>
+      <w:proofErr w:type="spellStart"/>
+      <w:r>
+        <w:rPr>
+          <w:b/>
+          <w:bCs/>
+          <w:color w:val="D86DCB" w:themeColor="accent5" w:themeTint="99"/>
+          <w:sz w:val="32"/>
+          <w:szCs w:val="32"/>
+        </w:rPr>
+        <w:t>i</w:t>
+      </w:r>
+      <w:proofErr w:type="spellEnd"/>
+      <w:r>
+        <w:rPr>
+          <w:b/>
+          <w:bCs/>
+          <w:color w:val="D86DCB" w:themeColor="accent5" w:themeTint="99"/>
+          <w:sz w:val="32"/>
+          <w:szCs w:val="32"/>
+        </w:rPr>
+        <w:t>]</w:t>
+      </w:r>
+    </w:p>
+    <w:p>
+      <w:pPr>
+        <w:jc w:val="both"/>
+        <w:rPr>
+          <w:b/>
+          <w:bCs/>
+          <w:color w:val="D86DCB" w:themeColor="accent5" w:themeTint="99"/>
+          <w:sz w:val="32"/>
+          <w:szCs w:val="32"/>
+        </w:rPr>
+      </w:pPr>
+      <w:r>
+        <w:rPr>
+          <w:b/>
+          <w:bCs/>
+          <w:color w:val="D86DCB" w:themeColor="accent5" w:themeTint="99"/>
+          <w:sz w:val="32"/>
+          <w:szCs w:val="32"/>
+        </w:rPr>
+        <w:t xml:space="preserve">    if needed in seen: # checking if the needed value is found in the dictionary or not</w:t>
+      </w:r>
+    </w:p>
+    <w:p>
+      <w:pPr>
+        <w:jc w:val="both"/>
+        <w:rPr>
+          <w:b/>
+          <w:bCs/>
+          <w:color w:val="D86DCB" w:themeColor="accent5" w:themeTint="99"/>
+          <w:sz w:val="32"/>
+          <w:szCs w:val="32"/>
+        </w:rPr>
+      </w:pPr>
+      <w:r>
+        <w:rPr>
+          <w:b/>
+          <w:bCs/>
+          <w:color w:val="D86DCB" w:themeColor="accent5" w:themeTint="99"/>
+          <w:sz w:val="32"/>
+          <w:szCs w:val="32"/>
+        </w:rPr>
+        <w:t xml:space="preserve">        output = [seen[needed], </w:t>
+      </w:r>
+      <w:proofErr w:type="spellStart"/>
+      <w:r>
+        <w:rPr>
+          <w:b/>
+          <w:bCs/>
+          <w:color w:val="D86DCB" w:themeColor="accent5" w:themeTint="99"/>
+          <w:sz w:val="32"/>
+          <w:szCs w:val="32"/>
+        </w:rPr>
+        <w:t>i</w:t>
+      </w:r>
+      <w:proofErr w:type="spellEnd"/>
+      <w:r>
+        <w:rPr>
+          <w:b/>
+          <w:bCs/>
+          <w:color w:val="D86DCB" w:themeColor="accent5" w:themeTint="99"/>
+          <w:sz w:val="32"/>
+          <w:szCs w:val="32"/>
+        </w:rPr>
+        <w:t>]</w:t>
+      </w:r>
+    </w:p>
+    <w:p>
+      <w:pPr>
+        <w:jc w:val="both"/>
+        <w:rPr>
+          <w:b/>
+          <w:bCs/>
+          <w:color w:val="D86DCB" w:themeColor="accent5" w:themeTint="99"/>
+          <w:sz w:val="32"/>
+          <w:szCs w:val="32"/>
+        </w:rPr>
+      </w:pPr>
+      <w:r>
+        <w:rPr>
+          <w:b/>
+          <w:bCs/>
+          <w:color w:val="D86DCB" w:themeColor="accent5" w:themeTint="99"/>
+          <w:sz w:val="32"/>
+          <w:szCs w:val="32"/>
+        </w:rPr>
+        <w:t xml:space="preserve">        print(output)</w:t>
+      </w:r>
+    </w:p>
+    <w:p>
+      <w:pPr>
+        <w:jc w:val="both"/>
+        <w:rPr>
+          <w:b/>
+          <w:bCs/>
+          <w:color w:val="D86DCB" w:themeColor="accent5" w:themeTint="99"/>
+          <w:sz w:val="32"/>
+          <w:szCs w:val="32"/>
+        </w:rPr>
+      </w:pPr>
+      <w:r>
+        <w:rPr>
+          <w:b/>
+          <w:bCs/>
+          <w:color w:val="D86DCB" w:themeColor="accent5" w:themeTint="99"/>
+          <w:sz w:val="32"/>
+          <w:szCs w:val="32"/>
+        </w:rPr>
+        <w:t xml:space="preserve">        break # break if the answer is found</w:t>
+      </w:r>
+    </w:p>
+    <w:p>
+      <w:pPr>
+        <w:jc w:val="both"/>
+        <w:rPr>
+          <w:b/>
+          <w:bCs/>
+          <w:color w:val="D86DCB" w:themeColor="accent5" w:themeTint="99"/>
+          <w:sz w:val="32"/>
+          <w:szCs w:val="32"/>
+        </w:rPr>
+      </w:pPr>
+      <w:r>
+        <w:rPr>
+          <w:b/>
+          <w:bCs/>
+          <w:color w:val="D86DCB" w:themeColor="accent5" w:themeTint="99"/>
+          <w:sz w:val="32"/>
+          <w:szCs w:val="32"/>
+        </w:rPr>
+        <w:t xml:space="preserve">    else:</w:t>
+      </w:r>
+    </w:p>
+    <w:p>
+      <w:pPr>
+        <w:jc w:val="both"/>
+        <w:rPr>
+          <w:b/>
+          <w:bCs/>
+          <w:color w:val="D86DCB" w:themeColor="accent5" w:themeTint="99"/>
+          <w:sz w:val="32"/>
+          <w:szCs w:val="32"/>
+        </w:rPr>
+      </w:pPr>
+      <w:r>
+        <w:rPr>
+          <w:b/>
+          <w:bCs/>
+          <w:color w:val="D86DCB" w:themeColor="accent5" w:themeTint="99"/>
+          <w:sz w:val="32"/>
+          <w:szCs w:val="32"/>
+        </w:rPr>
+        <w:t xml:space="preserve">        seen[</w:t>
+      </w:r>
+      <w:proofErr w:type="spellStart"/>
+      <w:r>
+        <w:rPr>
+          <w:b/>
+          <w:bCs/>
+          <w:color w:val="D86DCB" w:themeColor="accent5" w:themeTint="99"/>
+          <w:sz w:val="32"/>
+          <w:szCs w:val="32"/>
+        </w:rPr>
+        <w:t>nums</w:t>
+      </w:r>
+      <w:proofErr w:type="spellEnd"/>
+      <w:r>
+        <w:rPr>
+          <w:b/>
+          <w:bCs/>
+          <w:color w:val="D86DCB" w:themeColor="accent5" w:themeTint="99"/>
+          <w:sz w:val="32"/>
+          <w:szCs w:val="32"/>
+        </w:rPr>
+        <w:t>[</w:t>
+      </w:r>
+      <w:proofErr w:type="spellStart"/>
+      <w:r>
+        <w:rPr>
+          <w:b/>
+          <w:bCs/>
+          <w:color w:val="D86DCB" w:themeColor="accent5" w:themeTint="99"/>
+          <w:sz w:val="32"/>
+          <w:szCs w:val="32"/>
+        </w:rPr>
+        <w:t>i</w:t>
+      </w:r>
+      <w:proofErr w:type="spellEnd"/>
+      <w:r>
+        <w:rPr>
+          <w:b/>
+          <w:bCs/>
+          <w:color w:val="D86DCB" w:themeColor="accent5" w:themeTint="99"/>
+          <w:sz w:val="32"/>
+          <w:szCs w:val="32"/>
+        </w:rPr>
+        <w:t xml:space="preserve">]] = </w:t>
+      </w:r>
+      <w:proofErr w:type="spellStart"/>
+      <w:r>
+        <w:rPr>
+          <w:b/>
+          <w:bCs/>
+          <w:color w:val="D86DCB" w:themeColor="accent5" w:themeTint="99"/>
+          <w:sz w:val="32"/>
+          <w:szCs w:val="32"/>
+        </w:rPr>
+        <w:t>i</w:t>
+      </w:r>
+      <w:proofErr w:type="spellEnd"/>
+    </w:p>
+    <w:p>
+      <w:pPr>
+        <w:jc w:val="both"/>
+        <w:rPr>
+          <w:sz w:val="32"/>
+          <w:szCs w:val="32"/>
+        </w:rPr>
+      </w:pPr>
+    </w:p>
+    <w:p>
+      <w:pPr>
+        <w:jc w:val="both"/>
+        <w:rPr>
+          <w:sz w:val="32"/>
+          <w:szCs w:val="32"/>
+        </w:rPr>
+      </w:pPr>
+      <w:r>
+        <w:rPr>
+          <w:sz w:val="32"/>
+          <w:szCs w:val="32"/>
+        </w:rPr>
+        <w:lastRenderedPageBreak/>
         <w:t>The Pattern We Just Learned:</w:t>
       </w:r>
     </w:p>
@@ -1745,7 +2243,6 @@
           <w:sz w:val="32"/>
           <w:szCs w:val="32"/>
         </w:rPr>
-        <w:lastRenderedPageBreak/>
         <w:t>O(n)</w:t>
       </w:r>
     </w:p>
@@ -1991,6 +2488,7 @@
           <w:sz w:val="32"/>
           <w:szCs w:val="32"/>
         </w:rPr>
+        <w:lastRenderedPageBreak/>
         <w:t>Lists</w:t>
       </w:r>
     </w:p>
@@ -2070,6 +2568,676 @@
           <w:szCs w:val="32"/>
         </w:rPr>
         <w:t># This shift is what algorithm design is all about</w:t>
+      </w:r>
+    </w:p>
+    <w:p>
+      <w:pPr>
+        <w:jc w:val="both"/>
+        <w:rPr>
+          <w:sz w:val="32"/>
+          <w:szCs w:val="32"/>
+        </w:rPr>
+      </w:pPr>
+    </w:p>
+    <w:p>
+      <w:pPr>
+        <w:jc w:val="center"/>
+        <w:rPr>
+          <w:sz w:val="32"/>
+          <w:szCs w:val="32"/>
+        </w:rPr>
+      </w:pPr>
+      <w:r>
+        <w:rPr>
+          <w:sz w:val="32"/>
+          <w:szCs w:val="32"/>
+        </w:rPr>
+        <w:t>Break</w:t>
+      </w:r>
+    </w:p>
+    <w:p>
+      <w:pPr>
+        <w:jc w:val="both"/>
+        <w:rPr>
+          <w:sz w:val="32"/>
+          <w:szCs w:val="32"/>
+        </w:rPr>
+      </w:pPr>
+    </w:p>
+    <w:p>
+      <w:pPr>
+        <w:jc w:val="both"/>
+        <w:rPr>
+          <w:b/>
+          <w:bCs/>
+          <w:sz w:val="32"/>
+          <w:szCs w:val="32"/>
+        </w:rPr>
+      </w:pPr>
+      <w:r>
+        <w:rPr>
+          <w:b/>
+          <w:bCs/>
+          <w:sz w:val="32"/>
+          <w:szCs w:val="32"/>
+        </w:rPr>
+        <w:t>Two Pointer Pattern for Palindrome:</w:t>
+      </w:r>
+    </w:p>
+    <w:p>
+      <w:pPr>
+        <w:jc w:val="both"/>
+        <w:rPr>
+          <w:sz w:val="32"/>
+          <w:szCs w:val="32"/>
+        </w:rPr>
+      </w:pPr>
+      <w:r>
+        <w:rPr>
+          <w:sz w:val="32"/>
+          <w:szCs w:val="32"/>
+        </w:rPr>
+        <w:t># We can check if a string is palindrome or not using Two Pointer pattern. Examples, check if the first character matches with the last character of the string. Then check the second first and second last, and so on. Like this:</w:t>
+      </w:r>
+    </w:p>
+    <w:p>
+      <w:pPr>
+        <w:jc w:val="both"/>
+        <w:rPr>
+          <w:b/>
+          <w:bCs/>
+          <w:sz w:val="32"/>
+          <w:szCs w:val="32"/>
+        </w:rPr>
+      </w:pPr>
+      <w:r>
+        <w:rPr>
+          <w:b/>
+          <w:bCs/>
+          <w:sz w:val="32"/>
+          <w:szCs w:val="32"/>
+        </w:rPr>
+        <w:t>racecar</w:t>
+      </w:r>
+    </w:p>
+    <w:p>
+      <w:pPr>
+        <w:jc w:val="both"/>
+        <w:rPr>
+          <w:b/>
+          <w:bCs/>
+          <w:sz w:val="32"/>
+          <w:szCs w:val="32"/>
+        </w:rPr>
+      </w:pPr>
+      <w:r>
+        <w:rPr>
+          <w:b/>
+          <w:bCs/>
+          <w:sz w:val="32"/>
+          <w:szCs w:val="32"/>
+        </w:rPr>
+        <w:t xml:space="preserve">^           ^ </w:t>
+      </w:r>
+    </w:p>
+    <w:p>
+      <w:pPr>
+        <w:jc w:val="both"/>
+        <w:rPr>
+          <w:b/>
+          <w:bCs/>
+          <w:sz w:val="32"/>
+          <w:szCs w:val="32"/>
+        </w:rPr>
+      </w:pPr>
+      <w:r>
+        <w:rPr>
+          <w:b/>
+          <w:bCs/>
+          <w:sz w:val="32"/>
+          <w:szCs w:val="32"/>
+        </w:rPr>
+        <w:t xml:space="preserve">     </w:t>
+      </w:r>
+      <w:r>
+        <w:rPr>
+          <w:b/>
+          <w:bCs/>
+          <w:sz w:val="32"/>
+          <w:szCs w:val="32"/>
+        </w:rPr>
+        <w:sym w:font="Wingdings" w:char="F0E2"/>
+      </w:r>
+    </w:p>
+    <w:p>
+      <w:pPr>
+        <w:jc w:val="both"/>
+        <w:rPr>
+          <w:b/>
+          <w:bCs/>
+          <w:sz w:val="32"/>
+          <w:szCs w:val="32"/>
+        </w:rPr>
+      </w:pPr>
+      <w:r>
+        <w:rPr>
+          <w:b/>
+          <w:bCs/>
+          <w:sz w:val="32"/>
+          <w:szCs w:val="32"/>
+        </w:rPr>
+        <w:t>racecar</w:t>
+      </w:r>
+    </w:p>
+    <w:p>
+      <w:pPr>
+        <w:jc w:val="both"/>
+        <w:rPr>
+          <w:b/>
+          <w:bCs/>
+          <w:sz w:val="32"/>
+          <w:szCs w:val="32"/>
+        </w:rPr>
+      </w:pPr>
+      <w:r>
+        <w:rPr>
+          <w:b/>
+          <w:bCs/>
+          <w:sz w:val="32"/>
+          <w:szCs w:val="32"/>
+        </w:rPr>
+        <w:t xml:space="preserve">  ^        ^</w:t>
+      </w:r>
+    </w:p>
+    <w:p>
+      <w:pPr>
+        <w:jc w:val="both"/>
+        <w:rPr>
+          <w:sz w:val="32"/>
+          <w:szCs w:val="32"/>
+        </w:rPr>
+      </w:pPr>
+      <w:r>
+        <w:rPr>
+          <w:sz w:val="32"/>
+          <w:szCs w:val="32"/>
+        </w:rPr>
+        <w:t># This is called two-pointer pattern. Code:</w:t>
+      </w:r>
+    </w:p>
+    <w:p>
+      <w:pPr>
+        <w:jc w:val="both"/>
+        <w:rPr>
+          <w:b/>
+          <w:bCs/>
+          <w:color w:val="D86DCB" w:themeColor="accent5" w:themeTint="99"/>
+          <w:sz w:val="32"/>
+          <w:szCs w:val="32"/>
+        </w:rPr>
+      </w:pPr>
+      <w:r>
+        <w:rPr>
+          <w:b/>
+          <w:bCs/>
+          <w:color w:val="D86DCB" w:themeColor="accent5" w:themeTint="99"/>
+          <w:sz w:val="32"/>
+          <w:szCs w:val="32"/>
+        </w:rPr>
+        <w:t xml:space="preserve">def </w:t>
+      </w:r>
+      <w:proofErr w:type="spellStart"/>
+      <w:r>
+        <w:rPr>
+          <w:b/>
+          <w:bCs/>
+          <w:color w:val="D86DCB" w:themeColor="accent5" w:themeTint="99"/>
+          <w:sz w:val="32"/>
+          <w:szCs w:val="32"/>
+        </w:rPr>
+        <w:t>is_palindrome</w:t>
+      </w:r>
+      <w:proofErr w:type="spellEnd"/>
+      <w:r>
+        <w:rPr>
+          <w:b/>
+          <w:bCs/>
+          <w:color w:val="D86DCB" w:themeColor="accent5" w:themeTint="99"/>
+          <w:sz w:val="32"/>
+          <w:szCs w:val="32"/>
+        </w:rPr>
+        <w:t>(</w:t>
+      </w:r>
+      <w:proofErr w:type="spellStart"/>
+      <w:r>
+        <w:rPr>
+          <w:b/>
+          <w:bCs/>
+          <w:color w:val="D86DCB" w:themeColor="accent5" w:themeTint="99"/>
+          <w:sz w:val="32"/>
+          <w:szCs w:val="32"/>
+        </w:rPr>
+        <w:t>chk_str</w:t>
+      </w:r>
+      <w:proofErr w:type="spellEnd"/>
+      <w:r>
+        <w:rPr>
+          <w:b/>
+          <w:bCs/>
+          <w:color w:val="D86DCB" w:themeColor="accent5" w:themeTint="99"/>
+          <w:sz w:val="32"/>
+          <w:szCs w:val="32"/>
+        </w:rPr>
+        <w:t>):</w:t>
+      </w:r>
+    </w:p>
+    <w:p>
+      <w:pPr>
+        <w:jc w:val="both"/>
+        <w:rPr>
+          <w:b/>
+          <w:bCs/>
+          <w:color w:val="D86DCB" w:themeColor="accent5" w:themeTint="99"/>
+          <w:sz w:val="32"/>
+          <w:szCs w:val="32"/>
+        </w:rPr>
+      </w:pPr>
+      <w:r>
+        <w:rPr>
+          <w:b/>
+          <w:bCs/>
+          <w:color w:val="D86DCB" w:themeColor="accent5" w:themeTint="99"/>
+          <w:sz w:val="32"/>
+          <w:szCs w:val="32"/>
+        </w:rPr>
+        <w:t xml:space="preserve">    </w:t>
+      </w:r>
+      <w:proofErr w:type="spellStart"/>
+      <w:r>
+        <w:rPr>
+          <w:b/>
+          <w:bCs/>
+          <w:color w:val="D86DCB" w:themeColor="accent5" w:themeTint="99"/>
+          <w:sz w:val="32"/>
+          <w:szCs w:val="32"/>
+        </w:rPr>
+        <w:t>str_len</w:t>
+      </w:r>
+      <w:proofErr w:type="spellEnd"/>
+      <w:r>
+        <w:rPr>
+          <w:b/>
+          <w:bCs/>
+          <w:color w:val="D86DCB" w:themeColor="accent5" w:themeTint="99"/>
+          <w:sz w:val="32"/>
+          <w:szCs w:val="32"/>
+        </w:rPr>
+        <w:t xml:space="preserve"> = </w:t>
+      </w:r>
+      <w:proofErr w:type="spellStart"/>
+      <w:r>
+        <w:rPr>
+          <w:b/>
+          <w:bCs/>
+          <w:color w:val="D86DCB" w:themeColor="accent5" w:themeTint="99"/>
+          <w:sz w:val="32"/>
+          <w:szCs w:val="32"/>
+        </w:rPr>
+        <w:t>len</w:t>
+      </w:r>
+      <w:proofErr w:type="spellEnd"/>
+      <w:r>
+        <w:rPr>
+          <w:b/>
+          <w:bCs/>
+          <w:color w:val="D86DCB" w:themeColor="accent5" w:themeTint="99"/>
+          <w:sz w:val="32"/>
+          <w:szCs w:val="32"/>
+        </w:rPr>
+        <w:t>(</w:t>
+      </w:r>
+      <w:proofErr w:type="spellStart"/>
+      <w:r>
+        <w:rPr>
+          <w:b/>
+          <w:bCs/>
+          <w:color w:val="D86DCB" w:themeColor="accent5" w:themeTint="99"/>
+          <w:sz w:val="32"/>
+          <w:szCs w:val="32"/>
+        </w:rPr>
+        <w:t>chk_str</w:t>
+      </w:r>
+      <w:proofErr w:type="spellEnd"/>
+      <w:r>
+        <w:rPr>
+          <w:b/>
+          <w:bCs/>
+          <w:color w:val="D86DCB" w:themeColor="accent5" w:themeTint="99"/>
+          <w:sz w:val="32"/>
+          <w:szCs w:val="32"/>
+        </w:rPr>
+        <w:t>)</w:t>
+      </w:r>
+    </w:p>
+    <w:p>
+      <w:pPr>
+        <w:jc w:val="both"/>
+        <w:rPr>
+          <w:b/>
+          <w:bCs/>
+          <w:color w:val="D86DCB" w:themeColor="accent5" w:themeTint="99"/>
+          <w:sz w:val="32"/>
+          <w:szCs w:val="32"/>
+        </w:rPr>
+      </w:pPr>
+      <w:r>
+        <w:rPr>
+          <w:b/>
+          <w:bCs/>
+          <w:color w:val="D86DCB" w:themeColor="accent5" w:themeTint="99"/>
+          <w:sz w:val="32"/>
+          <w:szCs w:val="32"/>
+        </w:rPr>
+        <w:t xml:space="preserve">    for </w:t>
+      </w:r>
+      <w:proofErr w:type="spellStart"/>
+      <w:r>
+        <w:rPr>
+          <w:b/>
+          <w:bCs/>
+          <w:color w:val="D86DCB" w:themeColor="accent5" w:themeTint="99"/>
+          <w:sz w:val="32"/>
+          <w:szCs w:val="32"/>
+        </w:rPr>
+        <w:t>i</w:t>
+      </w:r>
+      <w:proofErr w:type="spellEnd"/>
+      <w:r>
+        <w:rPr>
+          <w:b/>
+          <w:bCs/>
+          <w:color w:val="D86DCB" w:themeColor="accent5" w:themeTint="99"/>
+          <w:sz w:val="32"/>
+          <w:szCs w:val="32"/>
+        </w:rPr>
+        <w:t xml:space="preserve"> in </w:t>
+      </w:r>
+      <w:proofErr w:type="gramStart"/>
+      <w:r>
+        <w:rPr>
+          <w:b/>
+          <w:bCs/>
+          <w:color w:val="D86DCB" w:themeColor="accent5" w:themeTint="99"/>
+          <w:sz w:val="32"/>
+          <w:szCs w:val="32"/>
+        </w:rPr>
+        <w:t>range(</w:t>
+      </w:r>
+      <w:proofErr w:type="spellStart"/>
+      <w:proofErr w:type="gramEnd"/>
+      <w:r>
+        <w:rPr>
+          <w:b/>
+          <w:bCs/>
+          <w:color w:val="D86DCB" w:themeColor="accent5" w:themeTint="99"/>
+          <w:sz w:val="32"/>
+          <w:szCs w:val="32"/>
+        </w:rPr>
+        <w:t>str_len</w:t>
+      </w:r>
+      <w:proofErr w:type="spellEnd"/>
+      <w:r>
+        <w:rPr>
+          <w:b/>
+          <w:bCs/>
+          <w:color w:val="D86DCB" w:themeColor="accent5" w:themeTint="99"/>
+          <w:sz w:val="32"/>
+          <w:szCs w:val="32"/>
+        </w:rPr>
+        <w:t xml:space="preserve"> // 2):</w:t>
+      </w:r>
+    </w:p>
+    <w:p>
+      <w:pPr>
+        <w:jc w:val="both"/>
+        <w:rPr>
+          <w:b/>
+          <w:bCs/>
+          <w:color w:val="D86DCB" w:themeColor="accent5" w:themeTint="99"/>
+          <w:sz w:val="32"/>
+          <w:szCs w:val="32"/>
+        </w:rPr>
+      </w:pPr>
+      <w:r>
+        <w:rPr>
+          <w:b/>
+          <w:bCs/>
+          <w:color w:val="D86DCB" w:themeColor="accent5" w:themeTint="99"/>
+          <w:sz w:val="32"/>
+          <w:szCs w:val="32"/>
+        </w:rPr>
+        <w:lastRenderedPageBreak/>
+        <w:t xml:space="preserve">        if </w:t>
+      </w:r>
+      <w:proofErr w:type="spellStart"/>
+      <w:r>
+        <w:rPr>
+          <w:b/>
+          <w:bCs/>
+          <w:color w:val="D86DCB" w:themeColor="accent5" w:themeTint="99"/>
+          <w:sz w:val="32"/>
+          <w:szCs w:val="32"/>
+        </w:rPr>
+        <w:t>chk_str</w:t>
+      </w:r>
+      <w:proofErr w:type="spellEnd"/>
+      <w:r>
+        <w:rPr>
+          <w:b/>
+          <w:bCs/>
+          <w:color w:val="D86DCB" w:themeColor="accent5" w:themeTint="99"/>
+          <w:sz w:val="32"/>
+          <w:szCs w:val="32"/>
+        </w:rPr>
+        <w:t>[</w:t>
+      </w:r>
+      <w:proofErr w:type="spellStart"/>
+      <w:r>
+        <w:rPr>
+          <w:b/>
+          <w:bCs/>
+          <w:color w:val="D86DCB" w:themeColor="accent5" w:themeTint="99"/>
+          <w:sz w:val="32"/>
+          <w:szCs w:val="32"/>
+        </w:rPr>
+        <w:t>i</w:t>
+      </w:r>
+      <w:proofErr w:type="spellEnd"/>
+      <w:proofErr w:type="gramStart"/>
+      <w:r>
+        <w:rPr>
+          <w:b/>
+          <w:bCs/>
+          <w:color w:val="D86DCB" w:themeColor="accent5" w:themeTint="99"/>
+          <w:sz w:val="32"/>
+          <w:szCs w:val="32"/>
+        </w:rPr>
+        <w:t>] !</w:t>
+      </w:r>
+      <w:proofErr w:type="gramEnd"/>
+      <w:r>
+        <w:rPr>
+          <w:b/>
+          <w:bCs/>
+          <w:color w:val="D86DCB" w:themeColor="accent5" w:themeTint="99"/>
+          <w:sz w:val="32"/>
+          <w:szCs w:val="32"/>
+        </w:rPr>
+        <w:t xml:space="preserve">= </w:t>
+      </w:r>
+      <w:proofErr w:type="spellStart"/>
+      <w:r>
+        <w:rPr>
+          <w:b/>
+          <w:bCs/>
+          <w:color w:val="D86DCB" w:themeColor="accent5" w:themeTint="99"/>
+          <w:sz w:val="32"/>
+          <w:szCs w:val="32"/>
+        </w:rPr>
+        <w:t>chk_str</w:t>
+      </w:r>
+      <w:proofErr w:type="spellEnd"/>
+      <w:r>
+        <w:rPr>
+          <w:b/>
+          <w:bCs/>
+          <w:color w:val="D86DCB" w:themeColor="accent5" w:themeTint="99"/>
+          <w:sz w:val="32"/>
+          <w:szCs w:val="32"/>
+        </w:rPr>
+        <w:t xml:space="preserve">[-1 - </w:t>
+      </w:r>
+      <w:proofErr w:type="spellStart"/>
+      <w:r>
+        <w:rPr>
+          <w:b/>
+          <w:bCs/>
+          <w:color w:val="D86DCB" w:themeColor="accent5" w:themeTint="99"/>
+          <w:sz w:val="32"/>
+          <w:szCs w:val="32"/>
+        </w:rPr>
+        <w:t>i</w:t>
+      </w:r>
+      <w:proofErr w:type="spellEnd"/>
+      <w:r>
+        <w:rPr>
+          <w:b/>
+          <w:bCs/>
+          <w:color w:val="D86DCB" w:themeColor="accent5" w:themeTint="99"/>
+          <w:sz w:val="32"/>
+          <w:szCs w:val="32"/>
+        </w:rPr>
+        <w:t>]:</w:t>
+      </w:r>
+    </w:p>
+    <w:p>
+      <w:pPr>
+        <w:jc w:val="both"/>
+        <w:rPr>
+          <w:b/>
+          <w:bCs/>
+          <w:color w:val="D86DCB" w:themeColor="accent5" w:themeTint="99"/>
+          <w:sz w:val="32"/>
+          <w:szCs w:val="32"/>
+        </w:rPr>
+      </w:pPr>
+      <w:r>
+        <w:rPr>
+          <w:b/>
+          <w:bCs/>
+          <w:color w:val="D86DCB" w:themeColor="accent5" w:themeTint="99"/>
+          <w:sz w:val="32"/>
+          <w:szCs w:val="32"/>
+        </w:rPr>
+        <w:t xml:space="preserve">            return False # </w:t>
+      </w:r>
+      <w:r>
+        <w:rPr>
+          <w:b/>
+          <w:bCs/>
+          <w:color w:val="D86DCB" w:themeColor="accent5" w:themeTint="99"/>
+          <w:sz w:val="32"/>
+          <w:szCs w:val="32"/>
+        </w:rPr>
+        <w:t>break loop and return false</w:t>
+      </w:r>
+    </w:p>
+    <w:p>
+      <w:pPr>
+        <w:jc w:val="both"/>
+        <w:rPr>
+          <w:b/>
+          <w:bCs/>
+          <w:color w:val="D86DCB" w:themeColor="accent5" w:themeTint="99"/>
+          <w:sz w:val="32"/>
+          <w:szCs w:val="32"/>
+        </w:rPr>
+      </w:pPr>
+      <w:r>
+        <w:rPr>
+          <w:b/>
+          <w:bCs/>
+          <w:color w:val="D86DCB" w:themeColor="accent5" w:themeTint="99"/>
+          <w:sz w:val="32"/>
+          <w:szCs w:val="32"/>
+        </w:rPr>
+        <w:t xml:space="preserve">    return True # if all matches and makes it here return true</w:t>
+      </w:r>
+    </w:p>
+    <w:p>
+      <w:pPr>
+        <w:jc w:val="both"/>
+        <w:rPr>
+          <w:b/>
+          <w:bCs/>
+          <w:color w:val="D86DCB" w:themeColor="accent5" w:themeTint="99"/>
+          <w:sz w:val="32"/>
+          <w:szCs w:val="32"/>
+        </w:rPr>
+      </w:pPr>
+      <w:r>
+        <w:rPr>
+          <w:b/>
+          <w:bCs/>
+          <w:color w:val="D86DCB" w:themeColor="accent5" w:themeTint="99"/>
+          <w:sz w:val="32"/>
+          <w:szCs w:val="32"/>
+        </w:rPr>
+        <w:t>if __name__ == '__main__':</w:t>
+      </w:r>
+    </w:p>
+    <w:p>
+      <w:pPr>
+        <w:jc w:val="both"/>
+        <w:rPr>
+          <w:b/>
+          <w:bCs/>
+          <w:color w:val="D86DCB" w:themeColor="accent5" w:themeTint="99"/>
+          <w:sz w:val="32"/>
+          <w:szCs w:val="32"/>
+        </w:rPr>
+      </w:pPr>
+      <w:r>
+        <w:rPr>
+          <w:b/>
+          <w:bCs/>
+          <w:color w:val="D86DCB" w:themeColor="accent5" w:themeTint="99"/>
+          <w:sz w:val="32"/>
+          <w:szCs w:val="32"/>
+        </w:rPr>
+        <w:t xml:space="preserve">    print(</w:t>
+      </w:r>
+      <w:proofErr w:type="spellStart"/>
+      <w:r>
+        <w:rPr>
+          <w:b/>
+          <w:bCs/>
+          <w:color w:val="D86DCB" w:themeColor="accent5" w:themeTint="99"/>
+          <w:sz w:val="32"/>
+          <w:szCs w:val="32"/>
+        </w:rPr>
+        <w:t>is_palindrome</w:t>
+      </w:r>
+      <w:proofErr w:type="spellEnd"/>
+      <w:r>
+        <w:rPr>
+          <w:b/>
+          <w:bCs/>
+          <w:color w:val="D86DCB" w:themeColor="accent5" w:themeTint="99"/>
+          <w:sz w:val="32"/>
+          <w:szCs w:val="32"/>
+        </w:rPr>
+        <w:t>('madam'))</w:t>
       </w:r>
     </w:p>
     <w:p>
@@ -6561,7 +7729,6 @@
   <w:style w:type="character" w:default="1" w:styleId="DefaultParagraphFont">
     <w:name w:val="Default Paragraph Font"/>
     <w:uiPriority w:val="1"/>
-    <w:semiHidden/>
     <w:unhideWhenUsed/>
   </w:style>
   <w:style w:type="table" w:default="1" w:styleId="TableNormal">

</xml_diff>

<commit_message>
revised and edited DSA doc
</commit_message>
<xml_diff>
--- a/programming_mental_models/p4_problem_solving_and_dsa_mental_models.docx
+++ b/programming_mental_models/p4_problem_solving_and_dsa_mental_models.docx
@@ -2698,7 +2698,17 @@
           <w:sz w:val="36"/>
           <w:szCs w:val="36"/>
         </w:rPr>
-        <w:t xml:space="preserve"> O(n)</w:t>
+        <w:t xml:space="preserve"> </w:t>
+      </w:r>
+      <w:r>
+        <w:rPr>
+          <w:rFonts w:ascii="Calibri" w:hAnsi="Calibri" w:cs="Calibri"/>
+          <w:b/>
+          <w:bCs/>
+          <w:sz w:val="36"/>
+          <w:szCs w:val="36"/>
+        </w:rPr>
+        <w:t>O(n)</w:t>
       </w:r>
       <w:r>
         <w:rPr>
@@ -3000,7 +3010,17 @@
           <w:sz w:val="36"/>
           <w:szCs w:val="36"/>
         </w:rPr>
-        <w:t xml:space="preserve"> O(n²)</w:t>
+        <w:t xml:space="preserve"> </w:t>
+      </w:r>
+      <w:r>
+        <w:rPr>
+          <w:rFonts w:ascii="Calibri" w:hAnsi="Calibri" w:cs="Calibri"/>
+          <w:b/>
+          <w:bCs/>
+          <w:sz w:val="36"/>
+          <w:szCs w:val="36"/>
+        </w:rPr>
+        <w:t>O(n²)</w:t>
       </w:r>
       <w:r>
         <w:rPr>
@@ -3815,21 +3835,19 @@
           <w:sz w:val="36"/>
           <w:szCs w:val="36"/>
         </w:rPr>
-        <w:t xml:space="preserve"># Time: O(n) loops through </w:t>
-      </w:r>
-      <w:proofErr w:type="spellStart"/>
-      <w:r>
-        <w:rPr>
-          <w:rFonts w:ascii="Calibri" w:hAnsi="Calibri" w:cs="Calibri"/>
-          <w:b/>
-          <w:bCs/>
-          <w:color w:val="D86DCB" w:themeColor="accent5" w:themeTint="99"/>
-          <w:sz w:val="36"/>
-          <w:szCs w:val="36"/>
-        </w:rPr>
-        <w:t>arr</w:t>
-      </w:r>
-      <w:proofErr w:type="spellEnd"/>
+        <w:t># Time: O(n) loops through arr</w:t>
+      </w:r>
+      <w:r>
+        <w:rPr>
+          <w:rFonts w:ascii="Calibri" w:hAnsi="Calibri" w:cs="Calibri"/>
+          <w:b/>
+          <w:bCs/>
+          <w:color w:val="D86DCB" w:themeColor="accent5" w:themeTint="99"/>
+          <w:sz w:val="36"/>
+          <w:szCs w:val="36"/>
+        </w:rPr>
+        <w:t>ay</w:t>
+      </w:r>
       <w:r>
         <w:rPr>
           <w:rFonts w:ascii="Calibri" w:hAnsi="Calibri" w:cs="Calibri"/>
@@ -5349,231 +5367,6 @@
           <w:szCs w:val="36"/>
         </w:rPr>
         <w:lastRenderedPageBreak/>
-        <w:t># Topics:</w:t>
-      </w:r>
-    </w:p>
-    <w:p>
-      <w:pPr>
-        <w:pStyle w:val="ListParagraph"/>
-        <w:numPr>
-          <w:ilvl w:val="0"/>
-          <w:numId w:val="30"/>
-        </w:numPr>
-        <w:jc w:val="both"/>
-        <w:rPr>
-          <w:rFonts w:ascii="Calibri" w:hAnsi="Calibri" w:cs="Calibri"/>
-          <w:sz w:val="36"/>
-          <w:szCs w:val="36"/>
-        </w:rPr>
-      </w:pPr>
-      <w:r>
-        <w:rPr>
-          <w:rFonts w:ascii="Calibri" w:hAnsi="Calibri" w:cs="Calibri"/>
-          <w:sz w:val="36"/>
-          <w:szCs w:val="36"/>
-        </w:rPr>
-        <w:t>Input/Output thinking</w:t>
-      </w:r>
-    </w:p>
-    <w:p>
-      <w:pPr>
-        <w:pStyle w:val="ListParagraph"/>
-        <w:numPr>
-          <w:ilvl w:val="0"/>
-          <w:numId w:val="30"/>
-        </w:numPr>
-        <w:jc w:val="both"/>
-        <w:rPr>
-          <w:rFonts w:ascii="Calibri" w:hAnsi="Calibri" w:cs="Calibri"/>
-          <w:sz w:val="36"/>
-          <w:szCs w:val="36"/>
-        </w:rPr>
-      </w:pPr>
-      <w:r>
-        <w:rPr>
-          <w:rFonts w:ascii="Calibri" w:hAnsi="Calibri" w:cs="Calibri"/>
-          <w:sz w:val="36"/>
-          <w:szCs w:val="36"/>
-        </w:rPr>
-        <w:t>Conditions</w:t>
-      </w:r>
-    </w:p>
-    <w:p>
-      <w:pPr>
-        <w:pStyle w:val="ListParagraph"/>
-        <w:numPr>
-          <w:ilvl w:val="0"/>
-          <w:numId w:val="30"/>
-        </w:numPr>
-        <w:jc w:val="both"/>
-        <w:rPr>
-          <w:rFonts w:ascii="Calibri" w:hAnsi="Calibri" w:cs="Calibri"/>
-          <w:sz w:val="36"/>
-          <w:szCs w:val="36"/>
-        </w:rPr>
-      </w:pPr>
-      <w:r>
-        <w:rPr>
-          <w:rFonts w:ascii="Calibri" w:hAnsi="Calibri" w:cs="Calibri"/>
-          <w:sz w:val="36"/>
-          <w:szCs w:val="36"/>
-        </w:rPr>
-        <w:t>Loops</w:t>
-      </w:r>
-    </w:p>
-    <w:p>
-      <w:pPr>
-        <w:pStyle w:val="ListParagraph"/>
-        <w:numPr>
-          <w:ilvl w:val="0"/>
-          <w:numId w:val="30"/>
-        </w:numPr>
-        <w:jc w:val="both"/>
-        <w:rPr>
-          <w:rFonts w:ascii="Calibri" w:hAnsi="Calibri" w:cs="Calibri"/>
-          <w:sz w:val="36"/>
-          <w:szCs w:val="36"/>
-        </w:rPr>
-      </w:pPr>
-      <w:r>
-        <w:rPr>
-          <w:rFonts w:ascii="Calibri" w:hAnsi="Calibri" w:cs="Calibri"/>
-          <w:sz w:val="36"/>
-          <w:szCs w:val="36"/>
-        </w:rPr>
-        <w:t>Pattern recognition</w:t>
-      </w:r>
-    </w:p>
-    <w:p>
-      <w:pPr>
-        <w:pStyle w:val="ListParagraph"/>
-        <w:numPr>
-          <w:ilvl w:val="0"/>
-          <w:numId w:val="30"/>
-        </w:numPr>
-        <w:jc w:val="both"/>
-        <w:rPr>
-          <w:rFonts w:ascii="Calibri" w:hAnsi="Calibri" w:cs="Calibri"/>
-          <w:sz w:val="36"/>
-          <w:szCs w:val="36"/>
-        </w:rPr>
-      </w:pPr>
-      <w:r>
-        <w:rPr>
-          <w:rFonts w:ascii="Calibri" w:hAnsi="Calibri" w:cs="Calibri"/>
-          <w:sz w:val="36"/>
-          <w:szCs w:val="36"/>
-        </w:rPr>
-        <w:t>Math problems</w:t>
-      </w:r>
-    </w:p>
-    <w:p>
-      <w:pPr>
-        <w:pStyle w:val="ListParagraph"/>
-        <w:numPr>
-          <w:ilvl w:val="0"/>
-          <w:numId w:val="30"/>
-        </w:numPr>
-        <w:jc w:val="both"/>
-        <w:rPr>
-          <w:rFonts w:ascii="Calibri" w:hAnsi="Calibri" w:cs="Calibri"/>
-          <w:sz w:val="36"/>
-          <w:szCs w:val="36"/>
-        </w:rPr>
-      </w:pPr>
-      <w:r>
-        <w:rPr>
-          <w:rFonts w:ascii="Calibri" w:hAnsi="Calibri" w:cs="Calibri"/>
-          <w:sz w:val="36"/>
-          <w:szCs w:val="36"/>
-        </w:rPr>
-        <w:t>Arrays (Lists)</w:t>
-      </w:r>
-    </w:p>
-    <w:p>
-      <w:pPr>
-        <w:pStyle w:val="ListParagraph"/>
-        <w:numPr>
-          <w:ilvl w:val="0"/>
-          <w:numId w:val="30"/>
-        </w:numPr>
-        <w:jc w:val="both"/>
-        <w:rPr>
-          <w:rFonts w:ascii="Calibri" w:hAnsi="Calibri" w:cs="Calibri"/>
-          <w:sz w:val="36"/>
-          <w:szCs w:val="36"/>
-        </w:rPr>
-      </w:pPr>
-      <w:r>
-        <w:rPr>
-          <w:rFonts w:ascii="Calibri" w:hAnsi="Calibri" w:cs="Calibri"/>
-          <w:sz w:val="36"/>
-          <w:szCs w:val="36"/>
-        </w:rPr>
-        <w:t>Strings</w:t>
-      </w:r>
-    </w:p>
-    <w:p>
-      <w:pPr>
-        <w:pStyle w:val="ListParagraph"/>
-        <w:numPr>
-          <w:ilvl w:val="0"/>
-          <w:numId w:val="30"/>
-        </w:numPr>
-        <w:jc w:val="both"/>
-        <w:rPr>
-          <w:rFonts w:ascii="Calibri" w:hAnsi="Calibri" w:cs="Calibri"/>
-          <w:sz w:val="36"/>
-          <w:szCs w:val="36"/>
-        </w:rPr>
-      </w:pPr>
-      <w:r>
-        <w:rPr>
-          <w:rFonts w:ascii="Calibri" w:hAnsi="Calibri" w:cs="Calibri"/>
-          <w:sz w:val="36"/>
-          <w:szCs w:val="36"/>
-        </w:rPr>
-        <w:t>Functions</w:t>
-      </w:r>
-    </w:p>
-    <w:p>
-      <w:pPr>
-        <w:pStyle w:val="ListParagraph"/>
-        <w:numPr>
-          <w:ilvl w:val="0"/>
-          <w:numId w:val="30"/>
-        </w:numPr>
-        <w:jc w:val="both"/>
-        <w:rPr>
-          <w:rFonts w:ascii="Calibri" w:hAnsi="Calibri" w:cs="Calibri"/>
-          <w:sz w:val="36"/>
-          <w:szCs w:val="36"/>
-        </w:rPr>
-      </w:pPr>
-      <w:r>
-        <w:rPr>
-          <w:rFonts w:ascii="Calibri" w:hAnsi="Calibri" w:cs="Calibri"/>
-          <w:sz w:val="36"/>
-          <w:szCs w:val="36"/>
-        </w:rPr>
-        <w:t>Time Complexity intuition</w:t>
-      </w:r>
-    </w:p>
-    <w:p>
-      <w:pPr>
-        <w:jc w:val="both"/>
-        <w:rPr>
-          <w:rFonts w:ascii="Calibri" w:hAnsi="Calibri" w:cs="Calibri"/>
-          <w:sz w:val="36"/>
-          <w:szCs w:val="36"/>
-        </w:rPr>
-      </w:pPr>
-      <w:r>
-        <w:rPr>
-          <w:rFonts w:ascii="Calibri" w:hAnsi="Calibri" w:cs="Calibri"/>
-          <w:sz w:val="36"/>
-          <w:szCs w:val="36"/>
-        </w:rPr>
         <w:t># 99% of DSA and competitive programming problems are solved with:</w:t>
       </w:r>
     </w:p>
@@ -5747,10 +5540,20 @@
       <w:r>
         <w:rPr>
           <w:rFonts w:ascii="Calibri" w:hAnsi="Calibri" w:cs="Calibri"/>
-          <w:sz w:val="36"/>
-          <w:szCs w:val="36"/>
-        </w:rPr>
-        <w:t xml:space="preserve">NOTE: Engineers think in inverse like instead of thinking </w:t>
+          <w:b/>
+          <w:bCs/>
+          <w:sz w:val="36"/>
+          <w:szCs w:val="36"/>
+        </w:rPr>
+        <w:t>NOTE:</w:t>
+      </w:r>
+      <w:r>
+        <w:rPr>
+          <w:rFonts w:ascii="Calibri" w:hAnsi="Calibri" w:cs="Calibri"/>
+          <w:sz w:val="36"/>
+          <w:szCs w:val="36"/>
+        </w:rPr>
+        <w:t xml:space="preserve"> Engineers think in inverse like instead of thinking </w:t>
       </w:r>
       <w:proofErr w:type="gramStart"/>
       <w:r>
@@ -5780,7 +5583,23 @@
           <w:sz w:val="36"/>
           <w:szCs w:val="36"/>
         </w:rPr>
-        <w:t xml:space="preserve"> think </w:t>
+        <w:t xml:space="preserve"> think</w:t>
+      </w:r>
+      <w:r>
+        <w:rPr>
+          <w:rFonts w:ascii="Calibri" w:hAnsi="Calibri" w:cs="Calibri"/>
+          <w:sz w:val="36"/>
+          <w:szCs w:val="36"/>
+        </w:rPr>
+        <w:t xml:space="preserve"> the reverse condition first</w:t>
+      </w:r>
+      <w:r>
+        <w:rPr>
+          <w:rFonts w:ascii="Calibri" w:hAnsi="Calibri" w:cs="Calibri"/>
+          <w:sz w:val="36"/>
+          <w:szCs w:val="36"/>
+        </w:rPr>
+        <w:t xml:space="preserve"> </w:t>
       </w:r>
       <w:r>
         <w:rPr>
@@ -5959,6 +5778,7 @@
           <w:sz w:val="36"/>
           <w:szCs w:val="36"/>
         </w:rPr>
+        <w:lastRenderedPageBreak/>
         <w:t>Initially:</w:t>
       </w:r>
     </w:p>
@@ -6572,6 +6392,7 @@
           <w:sz w:val="32"/>
           <w:szCs w:val="32"/>
         </w:rPr>
+        <w:lastRenderedPageBreak/>
         <w:t>[0, 1]</w:t>
       </w:r>
     </w:p>
@@ -6997,7 +6818,6 @@
           <w:sz w:val="36"/>
           <w:szCs w:val="36"/>
         </w:rPr>
-        <w:lastRenderedPageBreak/>
         <w:t xml:space="preserve">    else:</w:t>
       </w:r>
     </w:p>
@@ -7217,6 +7037,7 @@
           <w:sz w:val="32"/>
           <w:szCs w:val="32"/>
         </w:rPr>
+        <w:lastRenderedPageBreak/>
         <w:t xml:space="preserve">    If yes:</w:t>
       </w:r>
     </w:p>
@@ -7567,7 +7388,6 @@
           <w:sz w:val="36"/>
           <w:szCs w:val="36"/>
         </w:rPr>
-        <w:lastRenderedPageBreak/>
         <w:t>O(n)</w:t>
       </w:r>
     </w:p>
@@ -7995,142 +7815,160 @@
           <w:sz w:val="36"/>
           <w:szCs w:val="36"/>
         </w:rPr>
+        <w:t>racecar</w:t>
+      </w:r>
+    </w:p>
+    <w:p>
+      <w:pPr>
+        <w:jc w:val="both"/>
+        <w:rPr>
+          <w:rFonts w:ascii="Calibri" w:hAnsi="Calibri" w:cs="Calibri"/>
+          <w:b/>
+          <w:bCs/>
+          <w:sz w:val="36"/>
+          <w:szCs w:val="36"/>
+        </w:rPr>
+      </w:pPr>
+      <w:r>
+        <w:rPr>
+          <w:rFonts w:ascii="Calibri" w:hAnsi="Calibri" w:cs="Calibri"/>
+          <w:b/>
+          <w:bCs/>
+          <w:sz w:val="36"/>
+          <w:szCs w:val="36"/>
+        </w:rPr>
+        <w:t xml:space="preserve">^           ^ </w:t>
+      </w:r>
+    </w:p>
+    <w:p>
+      <w:pPr>
+        <w:jc w:val="both"/>
+        <w:rPr>
+          <w:rFonts w:ascii="Calibri" w:hAnsi="Calibri" w:cs="Calibri"/>
+          <w:b/>
+          <w:bCs/>
+          <w:sz w:val="36"/>
+          <w:szCs w:val="36"/>
+        </w:rPr>
+      </w:pPr>
+      <w:r>
+        <w:rPr>
+          <w:rFonts w:ascii="Calibri" w:hAnsi="Calibri" w:cs="Calibri"/>
+          <w:b/>
+          <w:bCs/>
+          <w:sz w:val="36"/>
+          <w:szCs w:val="36"/>
+        </w:rPr>
+        <w:t xml:space="preserve">     </w:t>
+      </w:r>
+      <w:r>
+        <w:rPr>
+          <w:rFonts w:ascii="Calibri" w:hAnsi="Calibri" w:cs="Calibri"/>
+          <w:b/>
+          <w:bCs/>
+          <w:sz w:val="36"/>
+          <w:szCs w:val="36"/>
+        </w:rPr>
+        <w:sym w:font="Wingdings" w:char="F0E2"/>
+      </w:r>
+    </w:p>
+    <w:p>
+      <w:pPr>
+        <w:jc w:val="both"/>
+        <w:rPr>
+          <w:rFonts w:ascii="Calibri" w:hAnsi="Calibri" w:cs="Calibri"/>
+          <w:b/>
+          <w:bCs/>
+          <w:sz w:val="36"/>
+          <w:szCs w:val="36"/>
+        </w:rPr>
+      </w:pPr>
+      <w:r>
+        <w:rPr>
+          <w:rFonts w:ascii="Calibri" w:hAnsi="Calibri" w:cs="Calibri"/>
+          <w:b/>
+          <w:bCs/>
+          <w:sz w:val="36"/>
+          <w:szCs w:val="36"/>
+        </w:rPr>
+        <w:t>racecar</w:t>
+      </w:r>
+    </w:p>
+    <w:p>
+      <w:pPr>
+        <w:jc w:val="both"/>
+        <w:rPr>
+          <w:rFonts w:ascii="Calibri" w:hAnsi="Calibri" w:cs="Calibri"/>
+          <w:b/>
+          <w:bCs/>
+          <w:sz w:val="36"/>
+          <w:szCs w:val="36"/>
+        </w:rPr>
+      </w:pPr>
+      <w:r>
+        <w:rPr>
+          <w:rFonts w:ascii="Calibri" w:hAnsi="Calibri" w:cs="Calibri"/>
+          <w:b/>
+          <w:bCs/>
+          <w:sz w:val="36"/>
+          <w:szCs w:val="36"/>
+        </w:rPr>
+        <w:t xml:space="preserve">  ^        ^</w:t>
+      </w:r>
+    </w:p>
+    <w:p>
+      <w:pPr>
+        <w:jc w:val="both"/>
+        <w:rPr>
+          <w:rFonts w:ascii="Calibri" w:hAnsi="Calibri" w:cs="Calibri"/>
+          <w:sz w:val="36"/>
+          <w:szCs w:val="36"/>
+        </w:rPr>
+      </w:pPr>
+      <w:r>
+        <w:rPr>
+          <w:rFonts w:ascii="Calibri" w:hAnsi="Calibri" w:cs="Calibri"/>
+          <w:sz w:val="36"/>
+          <w:szCs w:val="36"/>
+        </w:rPr>
+        <w:t># This way we only check or traverse the half of the length of the array.</w:t>
+      </w:r>
+    </w:p>
+    <w:p>
+      <w:pPr>
+        <w:jc w:val="both"/>
+        <w:rPr>
+          <w:rFonts w:ascii="Calibri" w:hAnsi="Calibri" w:cs="Calibri"/>
+          <w:sz w:val="36"/>
+          <w:szCs w:val="36"/>
+        </w:rPr>
+      </w:pPr>
+      <w:r>
+        <w:rPr>
+          <w:rFonts w:ascii="Calibri" w:hAnsi="Calibri" w:cs="Calibri"/>
+          <w:sz w:val="36"/>
+          <w:szCs w:val="36"/>
+        </w:rPr>
         <w:lastRenderedPageBreak/>
-        <w:t>racecar</w:t>
-      </w:r>
-    </w:p>
-    <w:p>
-      <w:pPr>
-        <w:jc w:val="both"/>
-        <w:rPr>
-          <w:rFonts w:ascii="Calibri" w:hAnsi="Calibri" w:cs="Calibri"/>
-          <w:b/>
-          <w:bCs/>
-          <w:sz w:val="36"/>
-          <w:szCs w:val="36"/>
-        </w:rPr>
-      </w:pPr>
-      <w:r>
-        <w:rPr>
-          <w:rFonts w:ascii="Calibri" w:hAnsi="Calibri" w:cs="Calibri"/>
-          <w:b/>
-          <w:bCs/>
-          <w:sz w:val="36"/>
-          <w:szCs w:val="36"/>
-        </w:rPr>
-        <w:t xml:space="preserve">^           ^ </w:t>
-      </w:r>
-    </w:p>
-    <w:p>
-      <w:pPr>
-        <w:jc w:val="both"/>
-        <w:rPr>
-          <w:rFonts w:ascii="Calibri" w:hAnsi="Calibri" w:cs="Calibri"/>
-          <w:b/>
-          <w:bCs/>
-          <w:sz w:val="36"/>
-          <w:szCs w:val="36"/>
-        </w:rPr>
-      </w:pPr>
-      <w:r>
-        <w:rPr>
-          <w:rFonts w:ascii="Calibri" w:hAnsi="Calibri" w:cs="Calibri"/>
-          <w:b/>
-          <w:bCs/>
-          <w:sz w:val="36"/>
-          <w:szCs w:val="36"/>
-        </w:rPr>
-        <w:t xml:space="preserve">     </w:t>
-      </w:r>
-      <w:r>
-        <w:rPr>
-          <w:rFonts w:ascii="Calibri" w:hAnsi="Calibri" w:cs="Calibri"/>
-          <w:b/>
-          <w:bCs/>
-          <w:sz w:val="36"/>
-          <w:szCs w:val="36"/>
-        </w:rPr>
-        <w:sym w:font="Wingdings" w:char="F0E2"/>
-      </w:r>
-    </w:p>
-    <w:p>
-      <w:pPr>
-        <w:jc w:val="both"/>
-        <w:rPr>
-          <w:rFonts w:ascii="Calibri" w:hAnsi="Calibri" w:cs="Calibri"/>
-          <w:b/>
-          <w:bCs/>
-          <w:sz w:val="36"/>
-          <w:szCs w:val="36"/>
-        </w:rPr>
-      </w:pPr>
-      <w:r>
-        <w:rPr>
-          <w:rFonts w:ascii="Calibri" w:hAnsi="Calibri" w:cs="Calibri"/>
-          <w:b/>
-          <w:bCs/>
-          <w:sz w:val="36"/>
-          <w:szCs w:val="36"/>
-        </w:rPr>
-        <w:t>racecar</w:t>
-      </w:r>
-    </w:p>
-    <w:p>
-      <w:pPr>
-        <w:jc w:val="both"/>
-        <w:rPr>
-          <w:rFonts w:ascii="Calibri" w:hAnsi="Calibri" w:cs="Calibri"/>
-          <w:b/>
-          <w:bCs/>
-          <w:sz w:val="36"/>
-          <w:szCs w:val="36"/>
-        </w:rPr>
-      </w:pPr>
-      <w:r>
-        <w:rPr>
-          <w:rFonts w:ascii="Calibri" w:hAnsi="Calibri" w:cs="Calibri"/>
-          <w:b/>
-          <w:bCs/>
-          <w:sz w:val="36"/>
-          <w:szCs w:val="36"/>
-        </w:rPr>
-        <w:t xml:space="preserve">  ^        ^</w:t>
-      </w:r>
-    </w:p>
-    <w:p>
-      <w:pPr>
-        <w:jc w:val="both"/>
-        <w:rPr>
-          <w:rFonts w:ascii="Calibri" w:hAnsi="Calibri" w:cs="Calibri"/>
-          <w:sz w:val="36"/>
-          <w:szCs w:val="36"/>
-        </w:rPr>
-      </w:pPr>
-      <w:r>
-        <w:rPr>
-          <w:rFonts w:ascii="Calibri" w:hAnsi="Calibri" w:cs="Calibri"/>
-          <w:sz w:val="36"/>
-          <w:szCs w:val="36"/>
-        </w:rPr>
-        <w:t># This way we only check or traverse the half of the length of the array.</w:t>
-      </w:r>
-    </w:p>
-    <w:p>
-      <w:pPr>
-        <w:jc w:val="both"/>
-        <w:rPr>
-          <w:rFonts w:ascii="Calibri" w:hAnsi="Calibri" w:cs="Calibri"/>
-          <w:sz w:val="36"/>
-          <w:szCs w:val="36"/>
-        </w:rPr>
-      </w:pPr>
-      <w:r>
-        <w:rPr>
-          <w:rFonts w:ascii="Calibri" w:hAnsi="Calibri" w:cs="Calibri"/>
-          <w:sz w:val="36"/>
-          <w:szCs w:val="36"/>
-        </w:rPr>
-        <w:t># And for loop visits each element once so</w:t>
+        <w:t xml:space="preserve"># And </w:t>
+      </w:r>
+      <w:r>
+        <w:rPr>
+          <w:rFonts w:ascii="Calibri" w:hAnsi="Calibri" w:cs="Calibri"/>
+          <w:b/>
+          <w:bCs/>
+          <w:sz w:val="36"/>
+          <w:szCs w:val="36"/>
+        </w:rPr>
+        <w:t>fo</w:t>
+      </w:r>
+      <w:r>
+        <w:rPr>
+          <w:rFonts w:ascii="Calibri" w:hAnsi="Calibri" w:cs="Calibri"/>
+          <w:sz w:val="36"/>
+          <w:szCs w:val="36"/>
+        </w:rPr>
+        <w:t>r loop visits each element once so</w:t>
       </w:r>
       <w:r>
         <w:rPr>
@@ -8748,111 +8586,111 @@
           <w:sz w:val="36"/>
           <w:szCs w:val="36"/>
         </w:rPr>
+        <w:t># This pattern can be used for reversing an array or string.</w:t>
+      </w:r>
+    </w:p>
+    <w:p>
+      <w:pPr>
+        <w:jc w:val="both"/>
+        <w:rPr>
+          <w:rFonts w:ascii="Calibri" w:hAnsi="Calibri" w:cs="Calibri"/>
+          <w:sz w:val="36"/>
+          <w:szCs w:val="36"/>
+        </w:rPr>
+      </w:pPr>
+    </w:p>
+    <w:p>
+      <w:pPr>
+        <w:jc w:val="center"/>
+        <w:rPr>
+          <w:rFonts w:ascii="Calibri" w:hAnsi="Calibri" w:cs="Calibri"/>
+          <w:sz w:val="36"/>
+          <w:szCs w:val="36"/>
+        </w:rPr>
+      </w:pPr>
+      <w:r>
+        <w:rPr>
+          <w:rFonts w:ascii="Calibri" w:hAnsi="Calibri" w:cs="Calibri"/>
+          <w:sz w:val="36"/>
+          <w:szCs w:val="36"/>
+        </w:rPr>
+        <w:t>Break</w:t>
+      </w:r>
+    </w:p>
+    <w:p>
+      <w:pPr>
+        <w:jc w:val="both"/>
+        <w:rPr>
+          <w:rFonts w:ascii="Calibri" w:hAnsi="Calibri" w:cs="Calibri"/>
+          <w:sz w:val="36"/>
+          <w:szCs w:val="36"/>
+        </w:rPr>
+      </w:pPr>
+    </w:p>
+    <w:p>
+      <w:pPr>
+        <w:jc w:val="both"/>
+        <w:rPr>
+          <w:rFonts w:ascii="Calibri" w:hAnsi="Calibri" w:cs="Calibri"/>
+          <w:b/>
+          <w:bCs/>
+          <w:sz w:val="36"/>
+          <w:szCs w:val="36"/>
+        </w:rPr>
+      </w:pPr>
+      <w:r>
+        <w:rPr>
+          <w:rFonts w:ascii="Calibri" w:hAnsi="Calibri" w:cs="Calibri"/>
+          <w:b/>
+          <w:bCs/>
+          <w:sz w:val="36"/>
+          <w:szCs w:val="36"/>
+        </w:rPr>
+        <w:t>Read &amp; Write Two Pointer Pattern:</w:t>
+      </w:r>
+    </w:p>
+    <w:p>
+      <w:pPr>
+        <w:jc w:val="both"/>
+        <w:rPr>
+          <w:rFonts w:ascii="Calibri" w:hAnsi="Calibri" w:cs="Calibri"/>
+          <w:sz w:val="36"/>
+          <w:szCs w:val="36"/>
+        </w:rPr>
+      </w:pPr>
+      <w:r>
+        <w:rPr>
+          <w:rFonts w:ascii="Calibri" w:hAnsi="Calibri" w:cs="Calibri"/>
+          <w:sz w:val="36"/>
+          <w:szCs w:val="36"/>
+        </w:rPr>
+        <w:t xml:space="preserve"># </w:t>
+      </w:r>
+      <w:r>
+        <w:rPr>
+          <w:rFonts w:ascii="Calibri" w:hAnsi="Calibri" w:cs="Calibri"/>
+          <w:sz w:val="36"/>
+          <w:szCs w:val="36"/>
+        </w:rPr>
+        <w:t>We can use the Read &amp; Write Two pointer pattern to move zeroes to the last (there’s multiple use cases)</w:t>
+      </w:r>
+    </w:p>
+    <w:p>
+      <w:pPr>
+        <w:jc w:val="both"/>
+        <w:rPr>
+          <w:rFonts w:ascii="Calibri" w:hAnsi="Calibri" w:cs="Calibri"/>
+          <w:sz w:val="36"/>
+          <w:szCs w:val="36"/>
+        </w:rPr>
+      </w:pPr>
+      <w:r>
+        <w:rPr>
+          <w:rFonts w:ascii="Calibri" w:hAnsi="Calibri" w:cs="Calibri"/>
+          <w:sz w:val="36"/>
+          <w:szCs w:val="36"/>
+        </w:rPr>
         <w:lastRenderedPageBreak/>
-        <w:t># This pattern can be used for reversing an array or string.</w:t>
-      </w:r>
-    </w:p>
-    <w:p>
-      <w:pPr>
-        <w:jc w:val="both"/>
-        <w:rPr>
-          <w:rFonts w:ascii="Calibri" w:hAnsi="Calibri" w:cs="Calibri"/>
-          <w:sz w:val="36"/>
-          <w:szCs w:val="36"/>
-        </w:rPr>
-      </w:pPr>
-    </w:p>
-    <w:p>
-      <w:pPr>
-        <w:jc w:val="center"/>
-        <w:rPr>
-          <w:rFonts w:ascii="Calibri" w:hAnsi="Calibri" w:cs="Calibri"/>
-          <w:sz w:val="36"/>
-          <w:szCs w:val="36"/>
-        </w:rPr>
-      </w:pPr>
-      <w:r>
-        <w:rPr>
-          <w:rFonts w:ascii="Calibri" w:hAnsi="Calibri" w:cs="Calibri"/>
-          <w:sz w:val="36"/>
-          <w:szCs w:val="36"/>
-        </w:rPr>
-        <w:t>Break</w:t>
-      </w:r>
-    </w:p>
-    <w:p>
-      <w:pPr>
-        <w:jc w:val="both"/>
-        <w:rPr>
-          <w:rFonts w:ascii="Calibri" w:hAnsi="Calibri" w:cs="Calibri"/>
-          <w:sz w:val="36"/>
-          <w:szCs w:val="36"/>
-        </w:rPr>
-      </w:pPr>
-    </w:p>
-    <w:p>
-      <w:pPr>
-        <w:jc w:val="both"/>
-        <w:rPr>
-          <w:rFonts w:ascii="Calibri" w:hAnsi="Calibri" w:cs="Calibri"/>
-          <w:b/>
-          <w:bCs/>
-          <w:sz w:val="36"/>
-          <w:szCs w:val="36"/>
-        </w:rPr>
-      </w:pPr>
-      <w:r>
-        <w:rPr>
-          <w:rFonts w:ascii="Calibri" w:hAnsi="Calibri" w:cs="Calibri"/>
-          <w:b/>
-          <w:bCs/>
-          <w:sz w:val="36"/>
-          <w:szCs w:val="36"/>
-        </w:rPr>
-        <w:t>Read &amp; Write Two Pointer Pattern:</w:t>
-      </w:r>
-    </w:p>
-    <w:p>
-      <w:pPr>
-        <w:jc w:val="both"/>
-        <w:rPr>
-          <w:rFonts w:ascii="Calibri" w:hAnsi="Calibri" w:cs="Calibri"/>
-          <w:sz w:val="36"/>
-          <w:szCs w:val="36"/>
-        </w:rPr>
-      </w:pPr>
-      <w:r>
-        <w:rPr>
-          <w:rFonts w:ascii="Calibri" w:hAnsi="Calibri" w:cs="Calibri"/>
-          <w:sz w:val="36"/>
-          <w:szCs w:val="36"/>
-        </w:rPr>
-        <w:t xml:space="preserve"># </w:t>
-      </w:r>
-      <w:r>
-        <w:rPr>
-          <w:rFonts w:ascii="Calibri" w:hAnsi="Calibri" w:cs="Calibri"/>
-          <w:sz w:val="36"/>
-          <w:szCs w:val="36"/>
-        </w:rPr>
-        <w:t>We can use the Read &amp; Write Two pointer pattern to move zeroes to the last (there’s multiple use cases)</w:t>
-      </w:r>
-    </w:p>
-    <w:p>
-      <w:pPr>
-        <w:jc w:val="both"/>
-        <w:rPr>
-          <w:rFonts w:ascii="Calibri" w:hAnsi="Calibri" w:cs="Calibri"/>
-          <w:sz w:val="36"/>
-          <w:szCs w:val="36"/>
-        </w:rPr>
-      </w:pPr>
-      <w:r>
-        <w:rPr>
-          <w:rFonts w:ascii="Calibri" w:hAnsi="Calibri" w:cs="Calibri"/>
-          <w:sz w:val="36"/>
-          <w:szCs w:val="36"/>
-        </w:rPr>
         <w:t># Here One Pointer reads through the list and Another Pointer marks the position where next non-zero value should be placed</w:t>
       </w:r>
     </w:p>
@@ -9058,7 +8896,53 @@
           <w:sz w:val="36"/>
           <w:szCs w:val="36"/>
         </w:rPr>
-        <w:t># Write pointer position will start from 0 and after finding a non-zero number (1) it will move that number to 0 index and write will increase by 1</w:t>
+        <w:t xml:space="preserve"># </w:t>
+      </w:r>
+      <w:r>
+        <w:rPr>
+          <w:rFonts w:ascii="Calibri" w:hAnsi="Calibri" w:cs="Calibri"/>
+          <w:b/>
+          <w:bCs/>
+          <w:sz w:val="36"/>
+          <w:szCs w:val="36"/>
+        </w:rPr>
+        <w:t>w</w:t>
+      </w:r>
+      <w:r>
+        <w:rPr>
+          <w:rFonts w:ascii="Calibri" w:hAnsi="Calibri" w:cs="Calibri"/>
+          <w:b/>
+          <w:bCs/>
+          <w:sz w:val="36"/>
+          <w:szCs w:val="36"/>
+        </w:rPr>
+        <w:t>rite</w:t>
+      </w:r>
+      <w:r>
+        <w:rPr>
+          <w:rFonts w:ascii="Calibri" w:hAnsi="Calibri" w:cs="Calibri"/>
+          <w:sz w:val="36"/>
+          <w:szCs w:val="36"/>
+        </w:rPr>
+        <w:t xml:space="preserve"> pointer position will start from 0 and after finding a non-zero number (1) it will move that number to 0 index and </w:t>
+      </w:r>
+      <w:r>
+        <w:rPr>
+          <w:rFonts w:ascii="Calibri" w:hAnsi="Calibri" w:cs="Calibri"/>
+          <w:b/>
+          <w:bCs/>
+          <w:sz w:val="36"/>
+          <w:szCs w:val="36"/>
+        </w:rPr>
+        <w:t>write</w:t>
+      </w:r>
+      <w:r>
+        <w:rPr>
+          <w:rFonts w:ascii="Calibri" w:hAnsi="Calibri" w:cs="Calibri"/>
+          <w:sz w:val="36"/>
+          <w:szCs w:val="36"/>
+        </w:rPr>
+        <w:t xml:space="preserve"> will increase by 1</w:t>
       </w:r>
       <w:r>
         <w:rPr>
@@ -9132,151 +9016,151 @@
           <w:sz w:val="36"/>
           <w:szCs w:val="36"/>
         </w:rPr>
+        <w:t xml:space="preserve"># Now once first </w:t>
+      </w:r>
+      <w:r>
+        <w:rPr>
+          <w:rFonts w:ascii="Calibri" w:hAnsi="Calibri" w:cs="Calibri"/>
+          <w:b/>
+          <w:bCs/>
+          <w:sz w:val="36"/>
+          <w:szCs w:val="36"/>
+        </w:rPr>
+        <w:t>for</w:t>
+      </w:r>
+      <w:r>
+        <w:rPr>
+          <w:rFonts w:ascii="Calibri" w:hAnsi="Calibri" w:cs="Calibri"/>
+          <w:sz w:val="36"/>
+          <w:szCs w:val="36"/>
+        </w:rPr>
+        <w:t xml:space="preserve"> loop is done and moving all the non-zero numbers to the left then we will replace everything after the write pointer position (which is </w:t>
+      </w:r>
+      <w:r>
+        <w:rPr>
+          <w:rFonts w:ascii="Calibri" w:hAnsi="Calibri" w:cs="Calibri"/>
+          <w:b/>
+          <w:bCs/>
+          <w:sz w:val="36"/>
+          <w:szCs w:val="36"/>
+        </w:rPr>
+        <w:t>3</w:t>
+      </w:r>
+      <w:r>
+        <w:rPr>
+          <w:rFonts w:ascii="Calibri" w:hAnsi="Calibri" w:cs="Calibri"/>
+          <w:sz w:val="36"/>
+          <w:szCs w:val="36"/>
+        </w:rPr>
+        <w:t xml:space="preserve"> now) with 0’s using another </w:t>
+      </w:r>
+      <w:r>
+        <w:rPr>
+          <w:rFonts w:ascii="Calibri" w:hAnsi="Calibri" w:cs="Calibri"/>
+          <w:b/>
+          <w:bCs/>
+          <w:sz w:val="36"/>
+          <w:szCs w:val="36"/>
+        </w:rPr>
+        <w:t>for</w:t>
+      </w:r>
+      <w:r>
+        <w:rPr>
+          <w:rFonts w:ascii="Calibri" w:hAnsi="Calibri" w:cs="Calibri"/>
+          <w:sz w:val="36"/>
+          <w:szCs w:val="36"/>
+        </w:rPr>
+        <w:t xml:space="preserve"> loop</w:t>
+      </w:r>
+    </w:p>
+    <w:p>
+      <w:pPr>
+        <w:jc w:val="both"/>
+        <w:rPr>
+          <w:rFonts w:ascii="Calibri" w:hAnsi="Calibri" w:cs="Calibri"/>
+          <w:b/>
+          <w:bCs/>
+          <w:sz w:val="36"/>
+          <w:szCs w:val="36"/>
+        </w:rPr>
+      </w:pPr>
+      <w:r>
+        <w:rPr>
+          <w:rFonts w:ascii="Calibri" w:hAnsi="Calibri" w:cs="Calibri"/>
+          <w:b/>
+          <w:bCs/>
+          <w:sz w:val="36"/>
+          <w:szCs w:val="36"/>
+        </w:rPr>
+        <w:t>[1, 3, 12, 0, 0]</w:t>
+      </w:r>
+    </w:p>
+    <w:p>
+      <w:pPr>
+        <w:jc w:val="both"/>
+        <w:rPr>
+          <w:rFonts w:ascii="Calibri" w:hAnsi="Calibri" w:cs="Calibri"/>
+          <w:sz w:val="36"/>
+          <w:szCs w:val="36"/>
+        </w:rPr>
+      </w:pPr>
+    </w:p>
+    <w:p>
+      <w:pPr>
+        <w:jc w:val="both"/>
+        <w:rPr>
+          <w:rFonts w:ascii="Calibri" w:hAnsi="Calibri" w:cs="Calibri"/>
+          <w:sz w:val="36"/>
+          <w:szCs w:val="36"/>
+        </w:rPr>
+      </w:pPr>
+      <w:r>
+        <w:rPr>
+          <w:rFonts w:ascii="Calibri" w:hAnsi="Calibri" w:cs="Calibri"/>
+          <w:sz w:val="36"/>
+          <w:szCs w:val="36"/>
+        </w:rPr>
+        <w:t>Mental Model:</w:t>
+      </w:r>
+    </w:p>
+    <w:p>
+      <w:pPr>
+        <w:jc w:val="both"/>
+        <w:rPr>
+          <w:rFonts w:ascii="Calibri" w:hAnsi="Calibri" w:cs="Calibri"/>
+          <w:sz w:val="36"/>
+          <w:szCs w:val="36"/>
+        </w:rPr>
+      </w:pPr>
+      <w:r>
+        <w:rPr>
+          <w:rFonts w:ascii="Calibri" w:hAnsi="Calibri" w:cs="Calibri"/>
+          <w:sz w:val="36"/>
+          <w:szCs w:val="36"/>
+        </w:rPr>
+        <w:t># Think of the array in two regions:</w:t>
+      </w:r>
+    </w:p>
+    <w:p>
+      <w:pPr>
+        <w:jc w:val="both"/>
+        <w:rPr>
+          <w:rFonts w:ascii="Calibri" w:hAnsi="Calibri" w:cs="Calibri"/>
+          <w:b/>
+          <w:bCs/>
+          <w:sz w:val="36"/>
+          <w:szCs w:val="36"/>
+        </w:rPr>
+      </w:pPr>
+      <w:r>
+        <w:rPr>
+          <w:rFonts w:ascii="Calibri" w:hAnsi="Calibri" w:cs="Calibri"/>
+          <w:b/>
+          <w:bCs/>
+          <w:sz w:val="36"/>
+          <w:szCs w:val="36"/>
+        </w:rPr>
         <w:lastRenderedPageBreak/>
-        <w:t xml:space="preserve"># Now once first </w:t>
-      </w:r>
-      <w:r>
-        <w:rPr>
-          <w:rFonts w:ascii="Calibri" w:hAnsi="Calibri" w:cs="Calibri"/>
-          <w:b/>
-          <w:bCs/>
-          <w:sz w:val="36"/>
-          <w:szCs w:val="36"/>
-        </w:rPr>
-        <w:t>for</w:t>
-      </w:r>
-      <w:r>
-        <w:rPr>
-          <w:rFonts w:ascii="Calibri" w:hAnsi="Calibri" w:cs="Calibri"/>
-          <w:sz w:val="36"/>
-          <w:szCs w:val="36"/>
-        </w:rPr>
-        <w:t xml:space="preserve"> loop is done and moving all the non-zero numbers to the left then we will replace everything after the write pointer position (which is </w:t>
-      </w:r>
-      <w:r>
-        <w:rPr>
-          <w:rFonts w:ascii="Calibri" w:hAnsi="Calibri" w:cs="Calibri"/>
-          <w:b/>
-          <w:bCs/>
-          <w:sz w:val="36"/>
-          <w:szCs w:val="36"/>
-        </w:rPr>
-        <w:t>3</w:t>
-      </w:r>
-      <w:r>
-        <w:rPr>
-          <w:rFonts w:ascii="Calibri" w:hAnsi="Calibri" w:cs="Calibri"/>
-          <w:sz w:val="36"/>
-          <w:szCs w:val="36"/>
-        </w:rPr>
-        <w:t xml:space="preserve"> now) with 0’s using another </w:t>
-      </w:r>
-      <w:r>
-        <w:rPr>
-          <w:rFonts w:ascii="Calibri" w:hAnsi="Calibri" w:cs="Calibri"/>
-          <w:b/>
-          <w:bCs/>
-          <w:sz w:val="36"/>
-          <w:szCs w:val="36"/>
-        </w:rPr>
-        <w:t>for</w:t>
-      </w:r>
-      <w:r>
-        <w:rPr>
-          <w:rFonts w:ascii="Calibri" w:hAnsi="Calibri" w:cs="Calibri"/>
-          <w:sz w:val="36"/>
-          <w:szCs w:val="36"/>
-        </w:rPr>
-        <w:t xml:space="preserve"> loop</w:t>
-      </w:r>
-    </w:p>
-    <w:p>
-      <w:pPr>
-        <w:jc w:val="both"/>
-        <w:rPr>
-          <w:rFonts w:ascii="Calibri" w:hAnsi="Calibri" w:cs="Calibri"/>
-          <w:b/>
-          <w:bCs/>
-          <w:sz w:val="36"/>
-          <w:szCs w:val="36"/>
-        </w:rPr>
-      </w:pPr>
-      <w:r>
-        <w:rPr>
-          <w:rFonts w:ascii="Calibri" w:hAnsi="Calibri" w:cs="Calibri"/>
-          <w:b/>
-          <w:bCs/>
-          <w:sz w:val="36"/>
-          <w:szCs w:val="36"/>
-        </w:rPr>
-        <w:t>[1, 3, 12, 0, 0]</w:t>
-      </w:r>
-    </w:p>
-    <w:p>
-      <w:pPr>
-        <w:jc w:val="both"/>
-        <w:rPr>
-          <w:rFonts w:ascii="Calibri" w:hAnsi="Calibri" w:cs="Calibri"/>
-          <w:sz w:val="36"/>
-          <w:szCs w:val="36"/>
-        </w:rPr>
-      </w:pPr>
-    </w:p>
-    <w:p>
-      <w:pPr>
-        <w:jc w:val="both"/>
-        <w:rPr>
-          <w:rFonts w:ascii="Calibri" w:hAnsi="Calibri" w:cs="Calibri"/>
-          <w:sz w:val="36"/>
-          <w:szCs w:val="36"/>
-        </w:rPr>
-      </w:pPr>
-      <w:r>
-        <w:rPr>
-          <w:rFonts w:ascii="Calibri" w:hAnsi="Calibri" w:cs="Calibri"/>
-          <w:sz w:val="36"/>
-          <w:szCs w:val="36"/>
-        </w:rPr>
-        <w:t>Mental Model:</w:t>
-      </w:r>
-    </w:p>
-    <w:p>
-      <w:pPr>
-        <w:jc w:val="both"/>
-        <w:rPr>
-          <w:rFonts w:ascii="Calibri" w:hAnsi="Calibri" w:cs="Calibri"/>
-          <w:sz w:val="36"/>
-          <w:szCs w:val="36"/>
-        </w:rPr>
-      </w:pPr>
-      <w:r>
-        <w:rPr>
-          <w:rFonts w:ascii="Calibri" w:hAnsi="Calibri" w:cs="Calibri"/>
-          <w:sz w:val="36"/>
-          <w:szCs w:val="36"/>
-        </w:rPr>
-        <w:t># Think of the array in two regions:</w:t>
-      </w:r>
-    </w:p>
-    <w:p>
-      <w:pPr>
-        <w:jc w:val="both"/>
-        <w:rPr>
-          <w:rFonts w:ascii="Calibri" w:hAnsi="Calibri" w:cs="Calibri"/>
-          <w:b/>
-          <w:bCs/>
-          <w:sz w:val="36"/>
-          <w:szCs w:val="36"/>
-        </w:rPr>
-      </w:pPr>
-      <w:r>
-        <w:rPr>
-          <w:rFonts w:ascii="Calibri" w:hAnsi="Calibri" w:cs="Calibri"/>
-          <w:b/>
-          <w:bCs/>
-          <w:sz w:val="36"/>
-          <w:szCs w:val="36"/>
-        </w:rPr>
         <w:t>Processed | Unprocessed</w:t>
       </w:r>
     </w:p>
@@ -9615,7 +9499,6 @@
           <w:sz w:val="32"/>
           <w:szCs w:val="32"/>
         </w:rPr>
-        <w:lastRenderedPageBreak/>
         <w:t>Again, there are temporarily two 3s. Still okay. Next:</w:t>
       </w:r>
     </w:p>
@@ -9704,12 +9587,9 @@
           <w:sz w:val="32"/>
           <w:szCs w:val="32"/>
         </w:rPr>
-        <w:t>Now all non-zero numbers have been compacted to the front. Finally, fill everything after write with zeros.</w:t>
-      </w:r>
-    </w:p>
-    <w:p>
-      <w:pPr>
-        <w:jc w:val="both"/>
+        <w:t xml:space="preserve">Now all non-zero numbers have been compacted to the front. Finally, fill everything after write with </w:t>
+      </w:r>
+      <w:r>
         <w:rPr>
           <w:rFonts w:ascii="Calibri" w:hAnsi="Calibri" w:cs="Calibri"/>
           <w:b/>
@@ -9717,8 +9597,12 @@
           <w:sz w:val="32"/>
           <w:szCs w:val="32"/>
         </w:rPr>
-      </w:pPr>
-      <w:r>
+        <w:t>0s</w:t>
+      </w:r>
+    </w:p>
+    <w:p>
+      <w:pPr>
+        <w:jc w:val="both"/>
         <w:rPr>
           <w:rFonts w:ascii="Calibri" w:hAnsi="Calibri" w:cs="Calibri"/>
           <w:b/>
@@ -9726,12 +9610,8 @@
           <w:sz w:val="32"/>
           <w:szCs w:val="32"/>
         </w:rPr>
-        <w:t>↓</w:t>
-      </w:r>
-    </w:p>
-    <w:p>
-      <w:pPr>
-        <w:jc w:val="both"/>
+      </w:pPr>
+      <w:r>
         <w:rPr>
           <w:rFonts w:ascii="Calibri" w:hAnsi="Calibri" w:cs="Calibri"/>
           <w:b/>
@@ -9739,8 +9619,12 @@
           <w:sz w:val="32"/>
           <w:szCs w:val="32"/>
         </w:rPr>
-      </w:pPr>
-      <w:r>
+        <w:t>↓</w:t>
+      </w:r>
+    </w:p>
+    <w:p>
+      <w:pPr>
+        <w:jc w:val="both"/>
         <w:rPr>
           <w:rFonts w:ascii="Calibri" w:hAnsi="Calibri" w:cs="Calibri"/>
           <w:b/>
@@ -9748,6 +9632,15 @@
           <w:sz w:val="32"/>
           <w:szCs w:val="32"/>
         </w:rPr>
+      </w:pPr>
+      <w:r>
+        <w:rPr>
+          <w:rFonts w:ascii="Calibri" w:hAnsi="Calibri" w:cs="Calibri"/>
+          <w:b/>
+          <w:bCs/>
+          <w:sz w:val="32"/>
+          <w:szCs w:val="32"/>
+        </w:rPr>
         <w:t>[1, 3, 12, 0, 0]</w:t>
       </w:r>
     </w:p>
@@ -9766,24 +9659,7 @@
           <w:sz w:val="36"/>
           <w:szCs w:val="36"/>
         </w:rPr>
-        <w:t># The duplicates disappear because we're intentionally overwriting the remaining positions with 0’s.</w:t>
-      </w:r>
-    </w:p>
-    <w:p>
-      <w:pPr>
-        <w:jc w:val="both"/>
-        <w:rPr>
-          <w:rFonts w:ascii="Calibri" w:hAnsi="Calibri" w:cs="Calibri"/>
-          <w:sz w:val="36"/>
-          <w:szCs w:val="36"/>
-        </w:rPr>
-      </w:pPr>
-      <w:r>
-        <w:rPr>
-          <w:rFonts w:ascii="Calibri" w:hAnsi="Calibri" w:cs="Calibri"/>
-          <w:sz w:val="36"/>
-          <w:szCs w:val="36"/>
-        </w:rPr>
+        <w:lastRenderedPageBreak/>
         <w:t>#</w:t>
       </w:r>
       <w:r>
@@ -9882,7 +9758,23 @@
           <w:sz w:val="36"/>
           <w:szCs w:val="36"/>
         </w:rPr>
-        <w:t xml:space="preserve"> loop only fills the remaining positions with zeros. Total work is</w:t>
+        <w:t xml:space="preserve"> loop only fills the remaining positions with </w:t>
+      </w:r>
+      <w:r>
+        <w:rPr>
+          <w:rFonts w:ascii="Calibri" w:hAnsi="Calibri" w:cs="Calibri"/>
+          <w:sz w:val="36"/>
+          <w:szCs w:val="36"/>
+        </w:rPr>
+        <w:t>0</w:t>
+      </w:r>
+      <w:r>
+        <w:rPr>
+          <w:rFonts w:ascii="Calibri" w:hAnsi="Calibri" w:cs="Calibri"/>
+          <w:sz w:val="36"/>
+          <w:szCs w:val="36"/>
+        </w:rPr>
+        <w:t>s. Total work is</w:t>
       </w:r>
       <w:r>
         <w:rPr>
@@ -10080,7 +9972,6 @@
           <w:sz w:val="36"/>
           <w:szCs w:val="36"/>
         </w:rPr>
-        <w:lastRenderedPageBreak/>
         <w:t>write = 0</w:t>
       </w:r>
     </w:p>
@@ -10457,6 +10348,7 @@
           <w:sz w:val="36"/>
           <w:szCs w:val="36"/>
         </w:rPr>
+        <w:lastRenderedPageBreak/>
         <w:t>Final Use Case:</w:t>
       </w:r>
     </w:p>
@@ -10631,7 +10523,6 @@
           <w:sz w:val="36"/>
           <w:szCs w:val="36"/>
         </w:rPr>
-        <w:lastRenderedPageBreak/>
         <w:t>Break</w:t>
       </w:r>
     </w:p>
@@ -10894,6 +10785,14 @@
           <w:szCs w:val="36"/>
         </w:rPr>
         <w:t>Empty</w:t>
+      </w:r>
+      <w:r>
+        <w:rPr>
+          <w:rFonts w:ascii="Calibri" w:hAnsi="Calibri" w:cs="Calibri"/>
+          <w:sz w:val="36"/>
+          <w:szCs w:val="36"/>
+        </w:rPr>
+        <w:tab/>
       </w:r>
       <w:r>
         <w:rPr>
@@ -10960,6 +10859,7 @@
                 <w:sz w:val="36"/>
                 <w:szCs w:val="36"/>
               </w:rPr>
+              <w:lastRenderedPageBreak/>
               <w:t>Operation</w:t>
             </w:r>
           </w:p>
@@ -11731,25 +11631,42 @@
           <w:sz w:val="36"/>
           <w:szCs w:val="36"/>
         </w:rPr>
-        <w:t># When a function or method call another function and that function in turns calls the other one, this is called a Call Stack.</w:t>
-      </w:r>
-    </w:p>
-    <w:p>
-      <w:pPr>
-        <w:jc w:val="both"/>
-        <w:rPr>
-          <w:rFonts w:ascii="Calibri" w:hAnsi="Calibri" w:cs="Calibri"/>
-          <w:sz w:val="36"/>
-          <w:szCs w:val="36"/>
-        </w:rPr>
-      </w:pPr>
-      <w:r>
-        <w:rPr>
-          <w:rFonts w:ascii="Calibri" w:hAnsi="Calibri" w:cs="Calibri"/>
-          <w:sz w:val="36"/>
-          <w:szCs w:val="36"/>
-        </w:rPr>
-        <w:lastRenderedPageBreak/>
+        <w:t xml:space="preserve"># When a function or method call another function and that function in turns calls the other one, this is called a </w:t>
+      </w:r>
+      <w:r>
+        <w:rPr>
+          <w:rFonts w:ascii="Calibri" w:hAnsi="Calibri" w:cs="Calibri"/>
+          <w:b/>
+          <w:bCs/>
+          <w:sz w:val="36"/>
+          <w:szCs w:val="36"/>
+        </w:rPr>
+        <w:t>Call Stack</w:t>
+      </w:r>
+      <w:r>
+        <w:rPr>
+          <w:rFonts w:ascii="Calibri" w:hAnsi="Calibri" w:cs="Calibri"/>
+          <w:sz w:val="36"/>
+          <w:szCs w:val="36"/>
+        </w:rPr>
+        <w:t>.</w:t>
+      </w:r>
+    </w:p>
+    <w:p>
+      <w:pPr>
+        <w:jc w:val="both"/>
+        <w:rPr>
+          <w:rFonts w:ascii="Calibri" w:hAnsi="Calibri" w:cs="Calibri"/>
+          <w:sz w:val="36"/>
+          <w:szCs w:val="36"/>
+        </w:rPr>
+      </w:pPr>
+      <w:r>
+        <w:rPr>
+          <w:rFonts w:ascii="Calibri" w:hAnsi="Calibri" w:cs="Calibri"/>
+          <w:sz w:val="36"/>
+          <w:szCs w:val="36"/>
+        </w:rPr>
         <w:t># The function which is called last gets executed first LIFO or Stack. This is why recursion and Event Loop works</w:t>
       </w:r>
     </w:p>
@@ -11964,6 +11881,7 @@
           <w:sz w:val="36"/>
           <w:szCs w:val="36"/>
         </w:rPr>
+        <w:lastRenderedPageBreak/>
         <w:t># Here the call stack looks like this:</w:t>
       </w:r>
     </w:p>
@@ -12262,7 +12180,6 @@
           <w:sz w:val="32"/>
           <w:szCs w:val="32"/>
         </w:rPr>
-        <w:lastRenderedPageBreak/>
         <w:t>empty</w:t>
       </w:r>
     </w:p>
@@ -12584,6 +12501,7 @@
           <w:sz w:val="36"/>
           <w:szCs w:val="36"/>
         </w:rPr>
+        <w:lastRenderedPageBreak/>
         <w:t># Here notice if opening bracket “</w:t>
       </w:r>
       <w:r>
@@ -12823,241 +12741,241 @@
           <w:sz w:val="36"/>
           <w:szCs w:val="36"/>
         </w:rPr>
+        <w:t>Code:</w:t>
+      </w:r>
+    </w:p>
+    <w:p>
+      <w:pPr>
+        <w:jc w:val="both"/>
+        <w:rPr>
+          <w:rFonts w:ascii="Calibri" w:hAnsi="Calibri" w:cs="Calibri"/>
+          <w:sz w:val="36"/>
+          <w:szCs w:val="36"/>
+        </w:rPr>
+      </w:pPr>
+      <w:r>
+        <w:rPr>
+          <w:rFonts w:ascii="Calibri" w:hAnsi="Calibri" w:cs="Calibri"/>
+          <w:sz w:val="36"/>
+          <w:szCs w:val="36"/>
+        </w:rPr>
+        <w:t># Here’s the code:</w:t>
+      </w:r>
+    </w:p>
+    <w:p>
+      <w:pPr>
+        <w:jc w:val="both"/>
+        <w:rPr>
+          <w:rFonts w:ascii="Calibri" w:hAnsi="Calibri" w:cs="Calibri"/>
+          <w:b/>
+          <w:bCs/>
+          <w:color w:val="D86DCB" w:themeColor="accent5" w:themeTint="99"/>
+          <w:sz w:val="36"/>
+          <w:szCs w:val="36"/>
+        </w:rPr>
+      </w:pPr>
+      <w:r>
+        <w:rPr>
+          <w:rFonts w:ascii="Calibri" w:hAnsi="Calibri" w:cs="Calibri"/>
+          <w:b/>
+          <w:bCs/>
+          <w:color w:val="D86DCB" w:themeColor="accent5" w:themeTint="99"/>
+          <w:sz w:val="36"/>
+          <w:szCs w:val="36"/>
+        </w:rPr>
+        <w:t xml:space="preserve">def </w:t>
+      </w:r>
+      <w:proofErr w:type="spellStart"/>
+      <w:r>
+        <w:rPr>
+          <w:rFonts w:ascii="Calibri" w:hAnsi="Calibri" w:cs="Calibri"/>
+          <w:b/>
+          <w:bCs/>
+          <w:color w:val="D86DCB" w:themeColor="accent5" w:themeTint="99"/>
+          <w:sz w:val="36"/>
+          <w:szCs w:val="36"/>
+        </w:rPr>
+        <w:t>is_valid_parentheses</w:t>
+      </w:r>
+      <w:proofErr w:type="spellEnd"/>
+      <w:r>
+        <w:rPr>
+          <w:rFonts w:ascii="Calibri" w:hAnsi="Calibri" w:cs="Calibri"/>
+          <w:b/>
+          <w:bCs/>
+          <w:color w:val="D86DCB" w:themeColor="accent5" w:themeTint="99"/>
+          <w:sz w:val="36"/>
+          <w:szCs w:val="36"/>
+        </w:rPr>
+        <w:t>(s):</w:t>
+      </w:r>
+    </w:p>
+    <w:p>
+      <w:pPr>
+        <w:jc w:val="both"/>
+        <w:rPr>
+          <w:rFonts w:ascii="Calibri" w:hAnsi="Calibri" w:cs="Calibri"/>
+          <w:b/>
+          <w:bCs/>
+          <w:color w:val="D86DCB" w:themeColor="accent5" w:themeTint="99"/>
+          <w:sz w:val="36"/>
+          <w:szCs w:val="36"/>
+        </w:rPr>
+      </w:pPr>
+      <w:r>
+        <w:rPr>
+          <w:rFonts w:ascii="Calibri" w:hAnsi="Calibri" w:cs="Calibri"/>
+          <w:b/>
+          <w:bCs/>
+          <w:color w:val="D86DCB" w:themeColor="accent5" w:themeTint="99"/>
+          <w:sz w:val="36"/>
+          <w:szCs w:val="36"/>
+        </w:rPr>
+        <w:t xml:space="preserve">    stack = []</w:t>
+      </w:r>
+    </w:p>
+    <w:p>
+      <w:pPr>
+        <w:jc w:val="both"/>
+        <w:rPr>
+          <w:rFonts w:ascii="Calibri" w:hAnsi="Calibri" w:cs="Calibri"/>
+          <w:b/>
+          <w:bCs/>
+          <w:color w:val="D86DCB" w:themeColor="accent5" w:themeTint="99"/>
+          <w:sz w:val="36"/>
+          <w:szCs w:val="36"/>
+        </w:rPr>
+      </w:pPr>
+      <w:r>
+        <w:rPr>
+          <w:rFonts w:ascii="Calibri" w:hAnsi="Calibri" w:cs="Calibri"/>
+          <w:b/>
+          <w:bCs/>
+          <w:color w:val="D86DCB" w:themeColor="accent5" w:themeTint="99"/>
+          <w:sz w:val="36"/>
+          <w:szCs w:val="36"/>
+        </w:rPr>
+        <w:t xml:space="preserve">    pairs = {</w:t>
+      </w:r>
+    </w:p>
+    <w:p>
+      <w:pPr>
+        <w:jc w:val="both"/>
+        <w:rPr>
+          <w:rFonts w:ascii="Calibri" w:hAnsi="Calibri" w:cs="Calibri"/>
+          <w:b/>
+          <w:bCs/>
+          <w:color w:val="D86DCB" w:themeColor="accent5" w:themeTint="99"/>
+          <w:sz w:val="36"/>
+          <w:szCs w:val="36"/>
+        </w:rPr>
+      </w:pPr>
+      <w:r>
+        <w:rPr>
+          <w:rFonts w:ascii="Calibri" w:hAnsi="Calibri" w:cs="Calibri"/>
+          <w:b/>
+          <w:bCs/>
+          <w:color w:val="D86DCB" w:themeColor="accent5" w:themeTint="99"/>
+          <w:sz w:val="36"/>
+          <w:szCs w:val="36"/>
+        </w:rPr>
+        <w:t xml:space="preserve">        ')' : '(',</w:t>
+      </w:r>
+    </w:p>
+    <w:p>
+      <w:pPr>
+        <w:jc w:val="both"/>
+        <w:rPr>
+          <w:rFonts w:ascii="Calibri" w:hAnsi="Calibri" w:cs="Calibri"/>
+          <w:b/>
+          <w:bCs/>
+          <w:color w:val="D86DCB" w:themeColor="accent5" w:themeTint="99"/>
+          <w:sz w:val="36"/>
+          <w:szCs w:val="36"/>
+        </w:rPr>
+      </w:pPr>
+      <w:r>
+        <w:rPr>
+          <w:rFonts w:ascii="Calibri" w:hAnsi="Calibri" w:cs="Calibri"/>
+          <w:b/>
+          <w:bCs/>
+          <w:color w:val="D86DCB" w:themeColor="accent5" w:themeTint="99"/>
+          <w:sz w:val="36"/>
+          <w:szCs w:val="36"/>
+        </w:rPr>
+        <w:t xml:space="preserve">        '}' : '{',</w:t>
+      </w:r>
+    </w:p>
+    <w:p>
+      <w:pPr>
+        <w:jc w:val="both"/>
+        <w:rPr>
+          <w:rFonts w:ascii="Calibri" w:hAnsi="Calibri" w:cs="Calibri"/>
+          <w:b/>
+          <w:bCs/>
+          <w:color w:val="D86DCB" w:themeColor="accent5" w:themeTint="99"/>
+          <w:sz w:val="36"/>
+          <w:szCs w:val="36"/>
+        </w:rPr>
+      </w:pPr>
+      <w:r>
+        <w:rPr>
+          <w:rFonts w:ascii="Calibri" w:hAnsi="Calibri" w:cs="Calibri"/>
+          <w:b/>
+          <w:bCs/>
+          <w:color w:val="D86DCB" w:themeColor="accent5" w:themeTint="99"/>
+          <w:sz w:val="36"/>
+          <w:szCs w:val="36"/>
+        </w:rPr>
+        <w:t xml:space="preserve">        ']' : '['</w:t>
+      </w:r>
+    </w:p>
+    <w:p>
+      <w:pPr>
+        <w:jc w:val="both"/>
+        <w:rPr>
+          <w:rFonts w:ascii="Calibri" w:hAnsi="Calibri" w:cs="Calibri"/>
+          <w:b/>
+          <w:bCs/>
+          <w:color w:val="D86DCB" w:themeColor="accent5" w:themeTint="99"/>
+          <w:sz w:val="36"/>
+          <w:szCs w:val="36"/>
+        </w:rPr>
+      </w:pPr>
+      <w:r>
+        <w:rPr>
+          <w:rFonts w:ascii="Calibri" w:hAnsi="Calibri" w:cs="Calibri"/>
+          <w:b/>
+          <w:bCs/>
+          <w:color w:val="D86DCB" w:themeColor="accent5" w:themeTint="99"/>
+          <w:sz w:val="36"/>
+          <w:szCs w:val="36"/>
+        </w:rPr>
+        <w:t xml:space="preserve">    }</w:t>
+      </w:r>
+    </w:p>
+    <w:p>
+      <w:pPr>
+        <w:jc w:val="both"/>
+        <w:rPr>
+          <w:rFonts w:ascii="Calibri" w:hAnsi="Calibri" w:cs="Calibri"/>
+          <w:b/>
+          <w:bCs/>
+          <w:color w:val="D86DCB" w:themeColor="accent5" w:themeTint="99"/>
+          <w:sz w:val="36"/>
+          <w:szCs w:val="36"/>
+        </w:rPr>
+      </w:pPr>
+      <w:r>
+        <w:rPr>
+          <w:rFonts w:ascii="Calibri" w:hAnsi="Calibri" w:cs="Calibri"/>
+          <w:b/>
+          <w:bCs/>
+          <w:color w:val="D86DCB" w:themeColor="accent5" w:themeTint="99"/>
+          <w:sz w:val="36"/>
+          <w:szCs w:val="36"/>
+        </w:rPr>
         <w:lastRenderedPageBreak/>
-        <w:t>Code:</w:t>
-      </w:r>
-    </w:p>
-    <w:p>
-      <w:pPr>
-        <w:jc w:val="both"/>
-        <w:rPr>
-          <w:rFonts w:ascii="Calibri" w:hAnsi="Calibri" w:cs="Calibri"/>
-          <w:sz w:val="36"/>
-          <w:szCs w:val="36"/>
-        </w:rPr>
-      </w:pPr>
-      <w:r>
-        <w:rPr>
-          <w:rFonts w:ascii="Calibri" w:hAnsi="Calibri" w:cs="Calibri"/>
-          <w:sz w:val="36"/>
-          <w:szCs w:val="36"/>
-        </w:rPr>
-        <w:t># Here’s the code:</w:t>
-      </w:r>
-    </w:p>
-    <w:p>
-      <w:pPr>
-        <w:jc w:val="both"/>
-        <w:rPr>
-          <w:rFonts w:ascii="Calibri" w:hAnsi="Calibri" w:cs="Calibri"/>
-          <w:b/>
-          <w:bCs/>
-          <w:color w:val="D86DCB" w:themeColor="accent5" w:themeTint="99"/>
-          <w:sz w:val="36"/>
-          <w:szCs w:val="36"/>
-        </w:rPr>
-      </w:pPr>
-      <w:r>
-        <w:rPr>
-          <w:rFonts w:ascii="Calibri" w:hAnsi="Calibri" w:cs="Calibri"/>
-          <w:b/>
-          <w:bCs/>
-          <w:color w:val="D86DCB" w:themeColor="accent5" w:themeTint="99"/>
-          <w:sz w:val="36"/>
-          <w:szCs w:val="36"/>
-        </w:rPr>
-        <w:t xml:space="preserve">def </w:t>
-      </w:r>
-      <w:proofErr w:type="spellStart"/>
-      <w:r>
-        <w:rPr>
-          <w:rFonts w:ascii="Calibri" w:hAnsi="Calibri" w:cs="Calibri"/>
-          <w:b/>
-          <w:bCs/>
-          <w:color w:val="D86DCB" w:themeColor="accent5" w:themeTint="99"/>
-          <w:sz w:val="36"/>
-          <w:szCs w:val="36"/>
-        </w:rPr>
-        <w:t>is_valid_parentheses</w:t>
-      </w:r>
-      <w:proofErr w:type="spellEnd"/>
-      <w:r>
-        <w:rPr>
-          <w:rFonts w:ascii="Calibri" w:hAnsi="Calibri" w:cs="Calibri"/>
-          <w:b/>
-          <w:bCs/>
-          <w:color w:val="D86DCB" w:themeColor="accent5" w:themeTint="99"/>
-          <w:sz w:val="36"/>
-          <w:szCs w:val="36"/>
-        </w:rPr>
-        <w:t>(s):</w:t>
-      </w:r>
-    </w:p>
-    <w:p>
-      <w:pPr>
-        <w:jc w:val="both"/>
-        <w:rPr>
-          <w:rFonts w:ascii="Calibri" w:hAnsi="Calibri" w:cs="Calibri"/>
-          <w:b/>
-          <w:bCs/>
-          <w:color w:val="D86DCB" w:themeColor="accent5" w:themeTint="99"/>
-          <w:sz w:val="36"/>
-          <w:szCs w:val="36"/>
-        </w:rPr>
-      </w:pPr>
-      <w:r>
-        <w:rPr>
-          <w:rFonts w:ascii="Calibri" w:hAnsi="Calibri" w:cs="Calibri"/>
-          <w:b/>
-          <w:bCs/>
-          <w:color w:val="D86DCB" w:themeColor="accent5" w:themeTint="99"/>
-          <w:sz w:val="36"/>
-          <w:szCs w:val="36"/>
-        </w:rPr>
-        <w:t xml:space="preserve">    stack = []</w:t>
-      </w:r>
-    </w:p>
-    <w:p>
-      <w:pPr>
-        <w:jc w:val="both"/>
-        <w:rPr>
-          <w:rFonts w:ascii="Calibri" w:hAnsi="Calibri" w:cs="Calibri"/>
-          <w:b/>
-          <w:bCs/>
-          <w:color w:val="D86DCB" w:themeColor="accent5" w:themeTint="99"/>
-          <w:sz w:val="36"/>
-          <w:szCs w:val="36"/>
-        </w:rPr>
-      </w:pPr>
-      <w:r>
-        <w:rPr>
-          <w:rFonts w:ascii="Calibri" w:hAnsi="Calibri" w:cs="Calibri"/>
-          <w:b/>
-          <w:bCs/>
-          <w:color w:val="D86DCB" w:themeColor="accent5" w:themeTint="99"/>
-          <w:sz w:val="36"/>
-          <w:szCs w:val="36"/>
-        </w:rPr>
-        <w:t xml:space="preserve">    pairs = {</w:t>
-      </w:r>
-    </w:p>
-    <w:p>
-      <w:pPr>
-        <w:jc w:val="both"/>
-        <w:rPr>
-          <w:rFonts w:ascii="Calibri" w:hAnsi="Calibri" w:cs="Calibri"/>
-          <w:b/>
-          <w:bCs/>
-          <w:color w:val="D86DCB" w:themeColor="accent5" w:themeTint="99"/>
-          <w:sz w:val="36"/>
-          <w:szCs w:val="36"/>
-        </w:rPr>
-      </w:pPr>
-      <w:r>
-        <w:rPr>
-          <w:rFonts w:ascii="Calibri" w:hAnsi="Calibri" w:cs="Calibri"/>
-          <w:b/>
-          <w:bCs/>
-          <w:color w:val="D86DCB" w:themeColor="accent5" w:themeTint="99"/>
-          <w:sz w:val="36"/>
-          <w:szCs w:val="36"/>
-        </w:rPr>
-        <w:t xml:space="preserve">        ')' : '(',</w:t>
-      </w:r>
-    </w:p>
-    <w:p>
-      <w:pPr>
-        <w:jc w:val="both"/>
-        <w:rPr>
-          <w:rFonts w:ascii="Calibri" w:hAnsi="Calibri" w:cs="Calibri"/>
-          <w:b/>
-          <w:bCs/>
-          <w:color w:val="D86DCB" w:themeColor="accent5" w:themeTint="99"/>
-          <w:sz w:val="36"/>
-          <w:szCs w:val="36"/>
-        </w:rPr>
-      </w:pPr>
-      <w:r>
-        <w:rPr>
-          <w:rFonts w:ascii="Calibri" w:hAnsi="Calibri" w:cs="Calibri"/>
-          <w:b/>
-          <w:bCs/>
-          <w:color w:val="D86DCB" w:themeColor="accent5" w:themeTint="99"/>
-          <w:sz w:val="36"/>
-          <w:szCs w:val="36"/>
-        </w:rPr>
-        <w:t xml:space="preserve">        '}' : '{',</w:t>
-      </w:r>
-    </w:p>
-    <w:p>
-      <w:pPr>
-        <w:jc w:val="both"/>
-        <w:rPr>
-          <w:rFonts w:ascii="Calibri" w:hAnsi="Calibri" w:cs="Calibri"/>
-          <w:b/>
-          <w:bCs/>
-          <w:color w:val="D86DCB" w:themeColor="accent5" w:themeTint="99"/>
-          <w:sz w:val="36"/>
-          <w:szCs w:val="36"/>
-        </w:rPr>
-      </w:pPr>
-      <w:r>
-        <w:rPr>
-          <w:rFonts w:ascii="Calibri" w:hAnsi="Calibri" w:cs="Calibri"/>
-          <w:b/>
-          <w:bCs/>
-          <w:color w:val="D86DCB" w:themeColor="accent5" w:themeTint="99"/>
-          <w:sz w:val="36"/>
-          <w:szCs w:val="36"/>
-        </w:rPr>
-        <w:t xml:space="preserve">        ']' : '['</w:t>
-      </w:r>
-    </w:p>
-    <w:p>
-      <w:pPr>
-        <w:jc w:val="both"/>
-        <w:rPr>
-          <w:rFonts w:ascii="Calibri" w:hAnsi="Calibri" w:cs="Calibri"/>
-          <w:b/>
-          <w:bCs/>
-          <w:color w:val="D86DCB" w:themeColor="accent5" w:themeTint="99"/>
-          <w:sz w:val="36"/>
-          <w:szCs w:val="36"/>
-        </w:rPr>
-      </w:pPr>
-      <w:r>
-        <w:rPr>
-          <w:rFonts w:ascii="Calibri" w:hAnsi="Calibri" w:cs="Calibri"/>
-          <w:b/>
-          <w:bCs/>
-          <w:color w:val="D86DCB" w:themeColor="accent5" w:themeTint="99"/>
-          <w:sz w:val="36"/>
-          <w:szCs w:val="36"/>
-        </w:rPr>
-        <w:t xml:space="preserve">    }</w:t>
-      </w:r>
-    </w:p>
-    <w:p>
-      <w:pPr>
-        <w:jc w:val="both"/>
-        <w:rPr>
-          <w:rFonts w:ascii="Calibri" w:hAnsi="Calibri" w:cs="Calibri"/>
-          <w:b/>
-          <w:bCs/>
-          <w:color w:val="D86DCB" w:themeColor="accent5" w:themeTint="99"/>
-          <w:sz w:val="36"/>
-          <w:szCs w:val="36"/>
-        </w:rPr>
-      </w:pPr>
-      <w:r>
-        <w:rPr>
-          <w:rFonts w:ascii="Calibri" w:hAnsi="Calibri" w:cs="Calibri"/>
-          <w:b/>
-          <w:bCs/>
-          <w:color w:val="D86DCB" w:themeColor="accent5" w:themeTint="99"/>
-          <w:sz w:val="36"/>
-          <w:szCs w:val="36"/>
-        </w:rPr>
         <w:t xml:space="preserve">    for </w:t>
       </w:r>
       <w:proofErr w:type="spellStart"/>
@@ -13581,7 +13499,6 @@
           <w:sz w:val="36"/>
           <w:szCs w:val="36"/>
         </w:rPr>
-        <w:lastRenderedPageBreak/>
         <w:t xml:space="preserve">    print(</w:t>
       </w:r>
       <w:proofErr w:type="spellStart"/>

</xml_diff>